<commit_message>
docs(acpos): close 22 gate-scoped runtime owner gaps
</commit_message>
<xml_diff>
--- a/ACPOS_DEV-01_企業自動開發系統_Mother_Basic_Design_OPTIMIZED.docx
+++ b/ACPOS_DEV-01_企業自動開發系統_Mother_Basic_Design_OPTIMIZED.docx
@@ -21269,10 +21269,7 @@
           </w:tcPr>
           <w:p>
             <w:r>
-              <w:rPr>
-                <w:sz w:val="10"/>
-              </w:rPr>
-              <w:t>—</w:t>
+              <w:t>INFO_COMMAND_RUNTIME</w:t>
             </w:r>
           </w:p>
         </w:tc>
@@ -21953,10 +21950,7 @@
           </w:tcPr>
           <w:p>
             <w:r>
-              <w:rPr>
-                <w:sz w:val="10"/>
-              </w:rPr>
-              <w:t>—</w:t>
+              <w:t>CANDIDATE_DECISION_RUNTIME</w:t>
             </w:r>
           </w:p>
         </w:tc>

</xml_diff>

<commit_message>
docs(acpos): bind 102 operation and runtime owner contracts
</commit_message>
<xml_diff>
--- a/ACPOS_DEV-01_企業自動開發系統_Mother_Basic_Design_OPTIMIZED.docx
+++ b/ACPOS_DEV-01_企業自動開發系統_Mother_Basic_Design_OPTIMIZED.docx
@@ -21098,10 +21098,7 @@
           </w:tcPr>
           <w:p>
             <w:r>
-              <w:rPr>
-                <w:sz w:val="10"/>
-              </w:rPr>
-              <w:t>—</w:t>
+              <w:t>Existing outreach owner</w:t>
             </w:r>
           </w:p>
         </w:tc>
@@ -21608,10 +21605,7 @@
           </w:tcPr>
           <w:p>
             <w:r>
-              <w:rPr>
-                <w:sz w:val="10"/>
-              </w:rPr>
-              <w:t>—</w:t>
+              <w:t>Existing enterprise development owner</w:t>
             </w:r>
           </w:p>
         </w:tc>
@@ -22289,10 +22283,7 @@
           </w:tcPr>
           <w:p>
             <w:r>
-              <w:rPr>
-                <w:sz w:val="10"/>
-              </w:rPr>
-              <w:t>—</w:t>
+              <w:t>Shared Acquisition / Knowledge owner</w:t>
             </w:r>
           </w:p>
         </w:tc>
@@ -22460,10 +22451,7 @@
           </w:tcPr>
           <w:p>
             <w:r>
-              <w:rPr>
-                <w:sz w:val="10"/>
-              </w:rPr>
-              <w:t>—</w:t>
+              <w:t>Shared Acquisition / Knowledge owner</w:t>
             </w:r>
           </w:p>
         </w:tc>
@@ -22631,10 +22619,7 @@
           </w:tcPr>
           <w:p>
             <w:r>
-              <w:rPr>
-                <w:sz w:val="10"/>
-              </w:rPr>
-              <w:t>—</w:t>
+              <w:t>Shared Acquisition / Knowledge owner</w:t>
             </w:r>
           </w:p>
         </w:tc>
@@ -22802,10 +22787,7 @@
           </w:tcPr>
           <w:p>
             <w:r>
-              <w:rPr>
-                <w:sz w:val="10"/>
-              </w:rPr>
-              <w:t>—</w:t>
+              <w:t>Shared Acquisition / Knowledge owner</w:t>
             </w:r>
           </w:p>
         </w:tc>
@@ -22973,10 +22955,7 @@
           </w:tcPr>
           <w:p>
             <w:r>
-              <w:rPr>
-                <w:sz w:val="10"/>
-              </w:rPr>
-              <w:t>—</w:t>
+              <w:t>Existing outreach owner</w:t>
             </w:r>
           </w:p>
         </w:tc>
@@ -23486,10 +23465,7 @@
           </w:tcPr>
           <w:p>
             <w:r>
-              <w:rPr>
-                <w:sz w:val="10"/>
-              </w:rPr>
-              <w:t>—</w:t>
+              <w:t>Existing enterprise development owner</w:t>
             </w:r>
           </w:p>
         </w:tc>
@@ -23657,10 +23633,7 @@
           </w:tcPr>
           <w:p>
             <w:r>
-              <w:rPr>
-                <w:sz w:val="10"/>
-              </w:rPr>
-              <w:t>—</w:t>
+              <w:t>Existing enterprise development owner</w:t>
             </w:r>
           </w:p>
         </w:tc>
@@ -25360,9 +25333,1204 @@
         </w:tc>
       </w:tr>
     </w:tbl>
+    <w:p>
+      <w:pPr>
+        <w:sectPr>
+          <w:pgSz w:w="11906" w:h="16838" w:orient="landscape"/>
+          <w:pgMar w:top="605" w:right="605" w:bottom="605" w:left="605" w:header="283" w:footer="283" w:gutter="0"/>
+          <w:cols w:space="720"/>
+          <w:docGrid w:linePitch="360"/>
+        </w:sectPr>
+      </w:pPr>
+    </w:p>
+    <w:p>
+      <w:pPr>
+        <w:pStyle w:val="Heading1"/>
+      </w:pPr>
+      <w:r>
+        <w:t>Batch 16 · Operation / Runtime Owner Binding Ledger</w:t>
+      </w:r>
+    </w:p>
+    <w:p>
+      <w:r>
+        <w:rPr>
+          <w:b/>
+        </w:rPr>
+        <w:t xml:space="preserve">[ACPOS-20260921-BATCH-16-OPERATION-OWNER-CONTRACT-CLOSURE-V1::PAGE::DEV-01] </w:t>
+      </w:r>
+      <w:r>
+        <w:t>The existing product-control registry cells above are updated only for the exact fields authorized by the matching Canonical Owner contract. No Method/Path is invented and no Runtime/Production execution is claimed.</w:t>
+      </w:r>
+    </w:p>
+    <w:tbl>
+      <w:tblPr>
+        <w:tblStyle w:val="TableGrid"/>
+        <w:tblW w:type="auto" w:w="0"/>
+        <w:tblLook w:firstColumn="1" w:firstRow="1" w:lastColumn="0" w:lastRow="0" w:noHBand="0" w:noVBand="1" w:val="04A0"/>
+      </w:tblPr>
+      <w:tblGrid>
+        <w:gridCol w:w="2290"/>
+        <w:gridCol w:w="2290"/>
+        <w:gridCol w:w="2290"/>
+        <w:gridCol w:w="2290"/>
+        <w:gridCol w:w="2290"/>
+        <w:gridCol w:w="2290"/>
+        <w:gridCol w:w="2290"/>
+      </w:tblGrid>
+      <w:tr>
+        <w:trPr>
+          <w:tblHeader w:val="true"/>
+        </w:trPr>
+        <w:tc>
+          <w:tcPr>
+            <w:tcW w:type="dxa" w:w="2290"/>
+            <w:shd w:fill="EDE9FE"/>
+          </w:tcPr>
+          <w:p>
+            <w:pPr>
+              <w:spacing w:before="0" w:after="0"/>
+            </w:pPr>
+            <w:r>
+              <w:rPr>
+                <w:sz w:val="8"/>
+              </w:rPr>
+              <w:t>Target UID</w:t>
+            </w:r>
+          </w:p>
+        </w:tc>
+        <w:tc>
+          <w:tcPr>
+            <w:tcW w:type="dxa" w:w="2290"/>
+            <w:shd w:fill="EDE9FE"/>
+          </w:tcPr>
+          <w:p>
+            <w:pPr>
+              <w:spacing w:before="0" w:after="0"/>
+            </w:pPr>
+            <w:r>
+              <w:rPr>
+                <w:sz w:val="8"/>
+              </w:rPr>
+              <w:t>Closed Field(s)</w:t>
+            </w:r>
+          </w:p>
+        </w:tc>
+        <w:tc>
+          <w:tcPr>
+            <w:tcW w:type="dxa" w:w="2290"/>
+            <w:shd w:fill="EDE9FE"/>
+          </w:tcPr>
+          <w:p>
+            <w:pPr>
+              <w:spacing w:before="0" w:after="0"/>
+            </w:pPr>
+            <w:r>
+              <w:rPr>
+                <w:sz w:val="8"/>
+              </w:rPr>
+              <w:t>Operation</w:t>
+            </w:r>
+          </w:p>
+        </w:tc>
+        <w:tc>
+          <w:tcPr>
+            <w:tcW w:type="dxa" w:w="2290"/>
+            <w:shd w:fill="EDE9FE"/>
+          </w:tcPr>
+          <w:p>
+            <w:pPr>
+              <w:spacing w:before="0" w:after="0"/>
+            </w:pPr>
+            <w:r>
+              <w:rPr>
+                <w:sz w:val="8"/>
+              </w:rPr>
+              <w:t>Runtime Owner</w:t>
+            </w:r>
+          </w:p>
+        </w:tc>
+        <w:tc>
+          <w:tcPr>
+            <w:tcW w:type="dxa" w:w="2290"/>
+            <w:shd w:fill="EDE9FE"/>
+          </w:tcPr>
+          <w:p>
+            <w:pPr>
+              <w:spacing w:before="0" w:after="0"/>
+            </w:pPr>
+            <w:r>
+              <w:rPr>
+                <w:sz w:val="8"/>
+              </w:rPr>
+              <w:t>Runtime Status</w:t>
+            </w:r>
+          </w:p>
+        </w:tc>
+        <w:tc>
+          <w:tcPr>
+            <w:tcW w:type="dxa" w:w="2290"/>
+            <w:shd w:fill="EDE9FE"/>
+          </w:tcPr>
+          <w:p>
+            <w:pPr>
+              <w:spacing w:before="0" w:after="0"/>
+            </w:pPr>
+            <w:r>
+              <w:rPr>
+                <w:sz w:val="8"/>
+              </w:rPr>
+              <w:t>Existing Method / Path</w:t>
+            </w:r>
+          </w:p>
+        </w:tc>
+        <w:tc>
+          <w:tcPr>
+            <w:tcW w:type="dxa" w:w="2290"/>
+            <w:shd w:fill="EDE9FE"/>
+          </w:tcPr>
+          <w:p>
+            <w:pPr>
+              <w:spacing w:before="0" w:after="0"/>
+            </w:pPr>
+            <w:r>
+              <w:rPr>
+                <w:sz w:val="8"/>
+              </w:rPr>
+              <w:t>Result</w:t>
+            </w:r>
+          </w:p>
+        </w:tc>
+      </w:tr>
+      <w:tr>
+        <w:tc>
+          <w:tcPr>
+            <w:tcW w:type="dxa" w:w="2290"/>
+          </w:tcPr>
+          <w:p>
+            <w:pPr>
+              <w:spacing w:before="0" w:after="0"/>
+            </w:pPr>
+            <w:r>
+              <w:rPr>
+                <w:sz w:val="8"/>
+              </w:rPr>
+              <w:t>DEV-01-BTN-CAMPAIGN-APPROVE</w:t>
+            </w:r>
+          </w:p>
+        </w:tc>
+        <w:tc>
+          <w:tcPr>
+            <w:tcW w:type="dxa" w:w="2290"/>
+          </w:tcPr>
+          <w:p>
+            <w:pPr>
+              <w:spacing w:before="0" w:after="0"/>
+            </w:pPr>
+            <w:r>
+              <w:rPr>
+                <w:sz w:val="8"/>
+              </w:rPr>
+              <w:t>runtime_owner</w:t>
+            </w:r>
+          </w:p>
+        </w:tc>
+        <w:tc>
+          <w:tcPr>
+            <w:tcW w:type="dxa" w:w="2290"/>
+          </w:tcPr>
+          <w:p>
+            <w:pPr>
+              <w:spacing w:before="0" w:after="0"/>
+            </w:pPr>
+            <w:r>
+              <w:rPr>
+                <w:sz w:val="8"/>
+              </w:rPr>
+              <w:t>approveOutreachCampaign</w:t>
+            </w:r>
+          </w:p>
+        </w:tc>
+        <w:tc>
+          <w:tcPr>
+            <w:tcW w:type="dxa" w:w="2290"/>
+          </w:tcPr>
+          <w:p>
+            <w:pPr>
+              <w:spacing w:before="0" w:after="0"/>
+            </w:pPr>
+            <w:r>
+              <w:rPr>
+                <w:sz w:val="8"/>
+              </w:rPr>
+              <w:t>Existing outreach owner</w:t>
+            </w:r>
+          </w:p>
+        </w:tc>
+        <w:tc>
+          <w:tcPr>
+            <w:tcW w:type="dxa" w:w="2290"/>
+          </w:tcPr>
+          <w:p>
+            <w:pPr>
+              <w:spacing w:before="0" w:after="0"/>
+            </w:pPr>
+            <w:r>
+              <w:rPr>
+                <w:sz w:val="8"/>
+              </w:rPr>
+              <w:t>EFFECTFUL_EXACT</w:t>
+            </w:r>
+          </w:p>
+        </w:tc>
+        <w:tc>
+          <w:tcPr>
+            <w:tcW w:type="dxa" w:w="2290"/>
+          </w:tcPr>
+          <w:p>
+            <w:pPr>
+              <w:spacing w:before="0" w:after="0"/>
+            </w:pPr>
+            <w:r>
+              <w:rPr>
+                <w:sz w:val="8"/>
+              </w:rPr>
+              <w:t>POST /v1/outreach/campaigns/{campaignId}/approve</w:t>
+            </w:r>
+          </w:p>
+        </w:tc>
+        <w:tc>
+          <w:tcPr>
+            <w:tcW w:type="dxa" w:w="2290"/>
+          </w:tcPr>
+          <w:p>
+            <w:pPr>
+              <w:spacing w:before="0" w:after="0"/>
+            </w:pPr>
+            <w:r>
+              <w:rPr>
+                <w:sz w:val="8"/>
+              </w:rPr>
+              <w:t>BOUND_BY_BATCH_16</w:t>
+            </w:r>
+          </w:p>
+        </w:tc>
+      </w:tr>
+      <w:tr>
+        <w:tc>
+          <w:tcPr>
+            <w:tcW w:type="dxa" w:w="2290"/>
+          </w:tcPr>
+          <w:p>
+            <w:pPr>
+              <w:spacing w:before="0" w:after="0"/>
+            </w:pPr>
+            <w:r>
+              <w:rPr>
+                <w:sz w:val="8"/>
+              </w:rPr>
+              <w:t>DEV-01-BTN-CANDIDATE-CREATE</w:t>
+            </w:r>
+          </w:p>
+        </w:tc>
+        <w:tc>
+          <w:tcPr>
+            <w:tcW w:type="dxa" w:w="2290"/>
+          </w:tcPr>
+          <w:p>
+            <w:pPr>
+              <w:spacing w:before="0" w:after="0"/>
+            </w:pPr>
+            <w:r>
+              <w:rPr>
+                <w:sz w:val="8"/>
+              </w:rPr>
+              <w:t>runtime_owner</w:t>
+            </w:r>
+          </w:p>
+        </w:tc>
+        <w:tc>
+          <w:tcPr>
+            <w:tcW w:type="dxa" w:w="2290"/>
+          </w:tcPr>
+          <w:p>
+            <w:pPr>
+              <w:spacing w:before="0" w:after="0"/>
+            </w:pPr>
+            <w:r>
+              <w:rPr>
+                <w:sz w:val="8"/>
+              </w:rPr>
+              <w:t>createCandidate</w:t>
+            </w:r>
+          </w:p>
+        </w:tc>
+        <w:tc>
+          <w:tcPr>
+            <w:tcW w:type="dxa" w:w="2290"/>
+          </w:tcPr>
+          <w:p>
+            <w:pPr>
+              <w:spacing w:before="0" w:after="0"/>
+            </w:pPr>
+            <w:r>
+              <w:rPr>
+                <w:sz w:val="8"/>
+              </w:rPr>
+              <w:t>Existing enterprise development owner</w:t>
+            </w:r>
+          </w:p>
+        </w:tc>
+        <w:tc>
+          <w:tcPr>
+            <w:tcW w:type="dxa" w:w="2290"/>
+          </w:tcPr>
+          <w:p>
+            <w:pPr>
+              <w:spacing w:before="0" w:after="0"/>
+            </w:pPr>
+            <w:r>
+              <w:rPr>
+                <w:sz w:val="8"/>
+              </w:rPr>
+              <w:t>EFFECTFUL_EXACT</w:t>
+            </w:r>
+          </w:p>
+        </w:tc>
+        <w:tc>
+          <w:tcPr>
+            <w:tcW w:type="dxa" w:w="2290"/>
+          </w:tcPr>
+          <w:p>
+            <w:pPr>
+              <w:spacing w:before="0" w:after="0"/>
+            </w:pPr>
+            <w:r>
+              <w:rPr>
+                <w:sz w:val="8"/>
+              </w:rPr>
+              <w:t>POST /v1/candidates</w:t>
+            </w:r>
+          </w:p>
+        </w:tc>
+        <w:tc>
+          <w:tcPr>
+            <w:tcW w:type="dxa" w:w="2290"/>
+          </w:tcPr>
+          <w:p>
+            <w:pPr>
+              <w:spacing w:before="0" w:after="0"/>
+            </w:pPr>
+            <w:r>
+              <w:rPr>
+                <w:sz w:val="8"/>
+              </w:rPr>
+              <w:t>BOUND_BY_BATCH_16</w:t>
+            </w:r>
+          </w:p>
+        </w:tc>
+      </w:tr>
+      <w:tr>
+        <w:tc>
+          <w:tcPr>
+            <w:tcW w:type="dxa" w:w="2290"/>
+          </w:tcPr>
+          <w:p>
+            <w:pPr>
+              <w:spacing w:before="0" w:after="0"/>
+            </w:pPr>
+            <w:r>
+              <w:rPr>
+                <w:sz w:val="8"/>
+              </w:rPr>
+              <w:t>DEV-01-BTN-DISCOVERY-PAUSE</w:t>
+            </w:r>
+          </w:p>
+        </w:tc>
+        <w:tc>
+          <w:tcPr>
+            <w:tcW w:type="dxa" w:w="2290"/>
+          </w:tcPr>
+          <w:p>
+            <w:pPr>
+              <w:spacing w:before="0" w:after="0"/>
+            </w:pPr>
+            <w:r>
+              <w:rPr>
+                <w:sz w:val="8"/>
+              </w:rPr>
+              <w:t>runtime_owner</w:t>
+            </w:r>
+          </w:p>
+        </w:tc>
+        <w:tc>
+          <w:tcPr>
+            <w:tcW w:type="dxa" w:w="2290"/>
+          </w:tcPr>
+          <w:p>
+            <w:pPr>
+              <w:spacing w:before="0" w:after="0"/>
+            </w:pPr>
+            <w:r>
+              <w:rPr>
+                <w:sz w:val="8"/>
+              </w:rPr>
+              <w:t>pauseCompanyDiscovery</w:t>
+            </w:r>
+          </w:p>
+        </w:tc>
+        <w:tc>
+          <w:tcPr>
+            <w:tcW w:type="dxa" w:w="2290"/>
+          </w:tcPr>
+          <w:p>
+            <w:pPr>
+              <w:spacing w:before="0" w:after="0"/>
+            </w:pPr>
+            <w:r>
+              <w:rPr>
+                <w:sz w:val="8"/>
+              </w:rPr>
+              <w:t>Shared Acquisition / Knowledge owner</w:t>
+            </w:r>
+          </w:p>
+        </w:tc>
+        <w:tc>
+          <w:tcPr>
+            <w:tcW w:type="dxa" w:w="2290"/>
+          </w:tcPr>
+          <w:p>
+            <w:pPr>
+              <w:spacing w:before="0" w:after="0"/>
+            </w:pPr>
+            <w:r>
+              <w:rPr>
+                <w:sz w:val="8"/>
+              </w:rPr>
+              <w:t>EFFECTFUL_EXACT</w:t>
+            </w:r>
+          </w:p>
+        </w:tc>
+        <w:tc>
+          <w:tcPr>
+            <w:tcW w:type="dxa" w:w="2290"/>
+          </w:tcPr>
+          <w:p>
+            <w:pPr>
+              <w:spacing w:before="0" w:after="0"/>
+            </w:pPr>
+            <w:r>
+              <w:rPr>
+                <w:sz w:val="8"/>
+              </w:rPr>
+              <w:t>POST /v1/outreach/discovery-jobs/{jobId}/pause</w:t>
+            </w:r>
+          </w:p>
+        </w:tc>
+        <w:tc>
+          <w:tcPr>
+            <w:tcW w:type="dxa" w:w="2290"/>
+          </w:tcPr>
+          <w:p>
+            <w:pPr>
+              <w:spacing w:before="0" w:after="0"/>
+            </w:pPr>
+            <w:r>
+              <w:rPr>
+                <w:sz w:val="8"/>
+              </w:rPr>
+              <w:t>BOUND_BY_BATCH_16</w:t>
+            </w:r>
+          </w:p>
+        </w:tc>
+      </w:tr>
+      <w:tr>
+        <w:tc>
+          <w:tcPr>
+            <w:tcW w:type="dxa" w:w="2290"/>
+          </w:tcPr>
+          <w:p>
+            <w:pPr>
+              <w:spacing w:before="0" w:after="0"/>
+            </w:pPr>
+            <w:r>
+              <w:rPr>
+                <w:sz w:val="8"/>
+              </w:rPr>
+              <w:t>DEV-01-BTN-DISCOVERY-RESUME</w:t>
+            </w:r>
+          </w:p>
+        </w:tc>
+        <w:tc>
+          <w:tcPr>
+            <w:tcW w:type="dxa" w:w="2290"/>
+          </w:tcPr>
+          <w:p>
+            <w:pPr>
+              <w:spacing w:before="0" w:after="0"/>
+            </w:pPr>
+            <w:r>
+              <w:rPr>
+                <w:sz w:val="8"/>
+              </w:rPr>
+              <w:t>runtime_owner</w:t>
+            </w:r>
+          </w:p>
+        </w:tc>
+        <w:tc>
+          <w:tcPr>
+            <w:tcW w:type="dxa" w:w="2290"/>
+          </w:tcPr>
+          <w:p>
+            <w:pPr>
+              <w:spacing w:before="0" w:after="0"/>
+            </w:pPr>
+            <w:r>
+              <w:rPr>
+                <w:sz w:val="8"/>
+              </w:rPr>
+              <w:t>resumeCompanyDiscovery</w:t>
+            </w:r>
+          </w:p>
+        </w:tc>
+        <w:tc>
+          <w:tcPr>
+            <w:tcW w:type="dxa" w:w="2290"/>
+          </w:tcPr>
+          <w:p>
+            <w:pPr>
+              <w:spacing w:before="0" w:after="0"/>
+            </w:pPr>
+            <w:r>
+              <w:rPr>
+                <w:sz w:val="8"/>
+              </w:rPr>
+              <w:t>Shared Acquisition / Knowledge owner</w:t>
+            </w:r>
+          </w:p>
+        </w:tc>
+        <w:tc>
+          <w:tcPr>
+            <w:tcW w:type="dxa" w:w="2290"/>
+          </w:tcPr>
+          <w:p>
+            <w:pPr>
+              <w:spacing w:before="0" w:after="0"/>
+            </w:pPr>
+            <w:r>
+              <w:rPr>
+                <w:sz w:val="8"/>
+              </w:rPr>
+              <w:t>EFFECTFUL_EXACT</w:t>
+            </w:r>
+          </w:p>
+        </w:tc>
+        <w:tc>
+          <w:tcPr>
+            <w:tcW w:type="dxa" w:w="2290"/>
+          </w:tcPr>
+          <w:p>
+            <w:pPr>
+              <w:spacing w:before="0" w:after="0"/>
+            </w:pPr>
+            <w:r>
+              <w:rPr>
+                <w:sz w:val="8"/>
+              </w:rPr>
+              <w:t>POST /v1/outreach/discovery-jobs/{jobId}/resume</w:t>
+            </w:r>
+          </w:p>
+        </w:tc>
+        <w:tc>
+          <w:tcPr>
+            <w:tcW w:type="dxa" w:w="2290"/>
+          </w:tcPr>
+          <w:p>
+            <w:pPr>
+              <w:spacing w:before="0" w:after="0"/>
+            </w:pPr>
+            <w:r>
+              <w:rPr>
+                <w:sz w:val="8"/>
+              </w:rPr>
+              <w:t>BOUND_BY_BATCH_16</w:t>
+            </w:r>
+          </w:p>
+        </w:tc>
+      </w:tr>
+      <w:tr>
+        <w:tc>
+          <w:tcPr>
+            <w:tcW w:type="dxa" w:w="2290"/>
+          </w:tcPr>
+          <w:p>
+            <w:pPr>
+              <w:spacing w:before="0" w:after="0"/>
+            </w:pPr>
+            <w:r>
+              <w:rPr>
+                <w:sz w:val="8"/>
+              </w:rPr>
+              <w:t>DEV-01-BTN-DISCOVERY-START</w:t>
+            </w:r>
+          </w:p>
+        </w:tc>
+        <w:tc>
+          <w:tcPr>
+            <w:tcW w:type="dxa" w:w="2290"/>
+          </w:tcPr>
+          <w:p>
+            <w:pPr>
+              <w:spacing w:before="0" w:after="0"/>
+            </w:pPr>
+            <w:r>
+              <w:rPr>
+                <w:sz w:val="8"/>
+              </w:rPr>
+              <w:t>runtime_owner</w:t>
+            </w:r>
+          </w:p>
+        </w:tc>
+        <w:tc>
+          <w:tcPr>
+            <w:tcW w:type="dxa" w:w="2290"/>
+          </w:tcPr>
+          <w:p>
+            <w:pPr>
+              <w:spacing w:before="0" w:after="0"/>
+            </w:pPr>
+            <w:r>
+              <w:rPr>
+                <w:sz w:val="8"/>
+              </w:rPr>
+              <w:t>startCompanyDiscovery</w:t>
+            </w:r>
+          </w:p>
+        </w:tc>
+        <w:tc>
+          <w:tcPr>
+            <w:tcW w:type="dxa" w:w="2290"/>
+          </w:tcPr>
+          <w:p>
+            <w:pPr>
+              <w:spacing w:before="0" w:after="0"/>
+            </w:pPr>
+            <w:r>
+              <w:rPr>
+                <w:sz w:val="8"/>
+              </w:rPr>
+              <w:t>Shared Acquisition / Knowledge owner</w:t>
+            </w:r>
+          </w:p>
+        </w:tc>
+        <w:tc>
+          <w:tcPr>
+            <w:tcW w:type="dxa" w:w="2290"/>
+          </w:tcPr>
+          <w:p>
+            <w:pPr>
+              <w:spacing w:before="0" w:after="0"/>
+            </w:pPr>
+            <w:r>
+              <w:rPr>
+                <w:sz w:val="8"/>
+              </w:rPr>
+              <w:t>EFFECTFUL_EXACT</w:t>
+            </w:r>
+          </w:p>
+        </w:tc>
+        <w:tc>
+          <w:tcPr>
+            <w:tcW w:type="dxa" w:w="2290"/>
+          </w:tcPr>
+          <w:p>
+            <w:pPr>
+              <w:spacing w:before="0" w:after="0"/>
+            </w:pPr>
+            <w:r>
+              <w:rPr>
+                <w:sz w:val="8"/>
+              </w:rPr>
+              <w:t>POST /v1/outreach/discovery-jobs</w:t>
+            </w:r>
+          </w:p>
+        </w:tc>
+        <w:tc>
+          <w:tcPr>
+            <w:tcW w:type="dxa" w:w="2290"/>
+          </w:tcPr>
+          <w:p>
+            <w:pPr>
+              <w:spacing w:before="0" w:after="0"/>
+            </w:pPr>
+            <w:r>
+              <w:rPr>
+                <w:sz w:val="8"/>
+              </w:rPr>
+              <w:t>BOUND_BY_BATCH_16</w:t>
+            </w:r>
+          </w:p>
+        </w:tc>
+      </w:tr>
+      <w:tr>
+        <w:tc>
+          <w:tcPr>
+            <w:tcW w:type="dxa" w:w="2290"/>
+          </w:tcPr>
+          <w:p>
+            <w:pPr>
+              <w:spacing w:before="0" w:after="0"/>
+            </w:pPr>
+            <w:r>
+              <w:rPr>
+                <w:sz w:val="8"/>
+              </w:rPr>
+              <w:t>DEV-01-BTN-DISCOVERY-STOP</w:t>
+            </w:r>
+          </w:p>
+        </w:tc>
+        <w:tc>
+          <w:tcPr>
+            <w:tcW w:type="dxa" w:w="2290"/>
+          </w:tcPr>
+          <w:p>
+            <w:pPr>
+              <w:spacing w:before="0" w:after="0"/>
+            </w:pPr>
+            <w:r>
+              <w:rPr>
+                <w:sz w:val="8"/>
+              </w:rPr>
+              <w:t>runtime_owner</w:t>
+            </w:r>
+          </w:p>
+        </w:tc>
+        <w:tc>
+          <w:tcPr>
+            <w:tcW w:type="dxa" w:w="2290"/>
+          </w:tcPr>
+          <w:p>
+            <w:pPr>
+              <w:spacing w:before="0" w:after="0"/>
+            </w:pPr>
+            <w:r>
+              <w:rPr>
+                <w:sz w:val="8"/>
+              </w:rPr>
+              <w:t>stopCompanyDiscovery</w:t>
+            </w:r>
+          </w:p>
+        </w:tc>
+        <w:tc>
+          <w:tcPr>
+            <w:tcW w:type="dxa" w:w="2290"/>
+          </w:tcPr>
+          <w:p>
+            <w:pPr>
+              <w:spacing w:before="0" w:after="0"/>
+            </w:pPr>
+            <w:r>
+              <w:rPr>
+                <w:sz w:val="8"/>
+              </w:rPr>
+              <w:t>Shared Acquisition / Knowledge owner</w:t>
+            </w:r>
+          </w:p>
+        </w:tc>
+        <w:tc>
+          <w:tcPr>
+            <w:tcW w:type="dxa" w:w="2290"/>
+          </w:tcPr>
+          <w:p>
+            <w:pPr>
+              <w:spacing w:before="0" w:after="0"/>
+            </w:pPr>
+            <w:r>
+              <w:rPr>
+                <w:sz w:val="8"/>
+              </w:rPr>
+              <w:t>EFFECTFUL_EXACT</w:t>
+            </w:r>
+          </w:p>
+        </w:tc>
+        <w:tc>
+          <w:tcPr>
+            <w:tcW w:type="dxa" w:w="2290"/>
+          </w:tcPr>
+          <w:p>
+            <w:pPr>
+              <w:spacing w:before="0" w:after="0"/>
+            </w:pPr>
+            <w:r>
+              <w:rPr>
+                <w:sz w:val="8"/>
+              </w:rPr>
+              <w:t>POST /v1/outreach/discovery-jobs/{jobId}/stop</w:t>
+            </w:r>
+          </w:p>
+        </w:tc>
+        <w:tc>
+          <w:tcPr>
+            <w:tcW w:type="dxa" w:w="2290"/>
+          </w:tcPr>
+          <w:p>
+            <w:pPr>
+              <w:spacing w:before="0" w:after="0"/>
+            </w:pPr>
+            <w:r>
+              <w:rPr>
+                <w:sz w:val="8"/>
+              </w:rPr>
+              <w:t>BOUND_BY_BATCH_16</w:t>
+            </w:r>
+          </w:p>
+        </w:tc>
+      </w:tr>
+      <w:tr>
+        <w:tc>
+          <w:tcPr>
+            <w:tcW w:type="dxa" w:w="2290"/>
+          </w:tcPr>
+          <w:p>
+            <w:pPr>
+              <w:spacing w:before="0" w:after="0"/>
+            </w:pPr>
+            <w:r>
+              <w:rPr>
+                <w:sz w:val="8"/>
+              </w:rPr>
+              <w:t>DEV-01-BTN-EMAIL-DISPATCH</w:t>
+            </w:r>
+          </w:p>
+        </w:tc>
+        <w:tc>
+          <w:tcPr>
+            <w:tcW w:type="dxa" w:w="2290"/>
+          </w:tcPr>
+          <w:p>
+            <w:pPr>
+              <w:spacing w:before="0" w:after="0"/>
+            </w:pPr>
+            <w:r>
+              <w:rPr>
+                <w:sz w:val="8"/>
+              </w:rPr>
+              <w:t>runtime_owner</w:t>
+            </w:r>
+          </w:p>
+        </w:tc>
+        <w:tc>
+          <w:tcPr>
+            <w:tcW w:type="dxa" w:w="2290"/>
+          </w:tcPr>
+          <w:p>
+            <w:pPr>
+              <w:spacing w:before="0" w:after="0"/>
+            </w:pPr>
+            <w:r>
+              <w:rPr>
+                <w:sz w:val="8"/>
+              </w:rPr>
+              <w:t>dispatchOutreachCampaign</w:t>
+            </w:r>
+          </w:p>
+        </w:tc>
+        <w:tc>
+          <w:tcPr>
+            <w:tcW w:type="dxa" w:w="2290"/>
+          </w:tcPr>
+          <w:p>
+            <w:pPr>
+              <w:spacing w:before="0" w:after="0"/>
+            </w:pPr>
+            <w:r>
+              <w:rPr>
+                <w:sz w:val="8"/>
+              </w:rPr>
+              <w:t>Existing outreach owner</w:t>
+            </w:r>
+          </w:p>
+        </w:tc>
+        <w:tc>
+          <w:tcPr>
+            <w:tcW w:type="dxa" w:w="2290"/>
+          </w:tcPr>
+          <w:p>
+            <w:pPr>
+              <w:spacing w:before="0" w:after="0"/>
+            </w:pPr>
+            <w:r>
+              <w:rPr>
+                <w:sz w:val="8"/>
+              </w:rPr>
+              <w:t>EFFECTFUL_EXACT</w:t>
+            </w:r>
+          </w:p>
+        </w:tc>
+        <w:tc>
+          <w:tcPr>
+            <w:tcW w:type="dxa" w:w="2290"/>
+          </w:tcPr>
+          <w:p>
+            <w:pPr>
+              <w:spacing w:before="0" w:after="0"/>
+            </w:pPr>
+            <w:r>
+              <w:rPr>
+                <w:sz w:val="8"/>
+              </w:rPr>
+              <w:t>POST /v1/outreach/campaigns/{campaignId}/dispatch</w:t>
+            </w:r>
+          </w:p>
+        </w:tc>
+        <w:tc>
+          <w:tcPr>
+            <w:tcW w:type="dxa" w:w="2290"/>
+          </w:tcPr>
+          <w:p>
+            <w:pPr>
+              <w:spacing w:before="0" w:after="0"/>
+            </w:pPr>
+            <w:r>
+              <w:rPr>
+                <w:sz w:val="8"/>
+              </w:rPr>
+              <w:t>BOUND_BY_BATCH_16</w:t>
+            </w:r>
+          </w:p>
+        </w:tc>
+      </w:tr>
+      <w:tr>
+        <w:tc>
+          <w:tcPr>
+            <w:tcW w:type="dxa" w:w="2290"/>
+          </w:tcPr>
+          <w:p>
+            <w:pPr>
+              <w:spacing w:before="0" w:after="0"/>
+            </w:pPr>
+            <w:r>
+              <w:rPr>
+                <w:sz w:val="8"/>
+              </w:rPr>
+              <w:t>DEV-01-BTN-MERGE</w:t>
+            </w:r>
+          </w:p>
+        </w:tc>
+        <w:tc>
+          <w:tcPr>
+            <w:tcW w:type="dxa" w:w="2290"/>
+          </w:tcPr>
+          <w:p>
+            <w:pPr>
+              <w:spacing w:before="0" w:after="0"/>
+            </w:pPr>
+            <w:r>
+              <w:rPr>
+                <w:sz w:val="8"/>
+              </w:rPr>
+              <w:t>runtime_owner</w:t>
+            </w:r>
+          </w:p>
+        </w:tc>
+        <w:tc>
+          <w:tcPr>
+            <w:tcW w:type="dxa" w:w="2290"/>
+          </w:tcPr>
+          <w:p>
+            <w:pPr>
+              <w:spacing w:before="0" w:after="0"/>
+            </w:pPr>
+            <w:r>
+              <w:rPr>
+                <w:sz w:val="8"/>
+              </w:rPr>
+              <w:t>mergeCompanyCandidate</w:t>
+            </w:r>
+          </w:p>
+        </w:tc>
+        <w:tc>
+          <w:tcPr>
+            <w:tcW w:type="dxa" w:w="2290"/>
+          </w:tcPr>
+          <w:p>
+            <w:pPr>
+              <w:spacing w:before="0" w:after="0"/>
+            </w:pPr>
+            <w:r>
+              <w:rPr>
+                <w:sz w:val="8"/>
+              </w:rPr>
+              <w:t>Existing enterprise development owner</w:t>
+            </w:r>
+          </w:p>
+        </w:tc>
+        <w:tc>
+          <w:tcPr>
+            <w:tcW w:type="dxa" w:w="2290"/>
+          </w:tcPr>
+          <w:p>
+            <w:pPr>
+              <w:spacing w:before="0" w:after="0"/>
+            </w:pPr>
+            <w:r>
+              <w:rPr>
+                <w:sz w:val="8"/>
+              </w:rPr>
+              <w:t>EFFECTFUL_EXACT</w:t>
+            </w:r>
+          </w:p>
+        </w:tc>
+        <w:tc>
+          <w:tcPr>
+            <w:tcW w:type="dxa" w:w="2290"/>
+          </w:tcPr>
+          <w:p>
+            <w:pPr>
+              <w:spacing w:before="0" w:after="0"/>
+            </w:pPr>
+            <w:r>
+              <w:rPr>
+                <w:sz w:val="8"/>
+              </w:rPr>
+              <w:t>POST /v1/outreach/companies/{companyId}/merge</w:t>
+            </w:r>
+          </w:p>
+        </w:tc>
+        <w:tc>
+          <w:tcPr>
+            <w:tcW w:type="dxa" w:w="2290"/>
+          </w:tcPr>
+          <w:p>
+            <w:pPr>
+              <w:spacing w:before="0" w:after="0"/>
+            </w:pPr>
+            <w:r>
+              <w:rPr>
+                <w:sz w:val="8"/>
+              </w:rPr>
+              <w:t>BOUND_BY_BATCH_16</w:t>
+            </w:r>
+          </w:p>
+        </w:tc>
+      </w:tr>
+      <w:tr>
+        <w:tc>
+          <w:tcPr>
+            <w:tcW w:type="dxa" w:w="2290"/>
+          </w:tcPr>
+          <w:p>
+            <w:pPr>
+              <w:spacing w:before="0" w:after="0"/>
+            </w:pPr>
+            <w:r>
+              <w:rPr>
+                <w:sz w:val="8"/>
+              </w:rPr>
+              <w:t>DEV-01-BTN-MERGE-PREVIEW</w:t>
+            </w:r>
+          </w:p>
+        </w:tc>
+        <w:tc>
+          <w:tcPr>
+            <w:tcW w:type="dxa" w:w="2290"/>
+          </w:tcPr>
+          <w:p>
+            <w:pPr>
+              <w:spacing w:before="0" w:after="0"/>
+            </w:pPr>
+            <w:r>
+              <w:rPr>
+                <w:sz w:val="8"/>
+              </w:rPr>
+              <w:t>runtime_owner</w:t>
+            </w:r>
+          </w:p>
+        </w:tc>
+        <w:tc>
+          <w:tcPr>
+            <w:tcW w:type="dxa" w:w="2290"/>
+          </w:tcPr>
+          <w:p>
+            <w:pPr>
+              <w:spacing w:before="0" w:after="0"/>
+            </w:pPr>
+            <w:r>
+              <w:rPr>
+                <w:sz w:val="8"/>
+              </w:rPr>
+              <w:t>previewCompanyMerge</w:t>
+            </w:r>
+          </w:p>
+        </w:tc>
+        <w:tc>
+          <w:tcPr>
+            <w:tcW w:type="dxa" w:w="2290"/>
+          </w:tcPr>
+          <w:p>
+            <w:pPr>
+              <w:spacing w:before="0" w:after="0"/>
+            </w:pPr>
+            <w:r>
+              <w:rPr>
+                <w:sz w:val="8"/>
+              </w:rPr>
+              <w:t>Existing enterprise development owner</w:t>
+            </w:r>
+          </w:p>
+        </w:tc>
+        <w:tc>
+          <w:tcPr>
+            <w:tcW w:type="dxa" w:w="2290"/>
+          </w:tcPr>
+          <w:p>
+            <w:pPr>
+              <w:spacing w:before="0" w:after="0"/>
+            </w:pPr>
+            <w:r>
+              <w:rPr>
+                <w:sz w:val="8"/>
+              </w:rPr>
+              <w:t>EFFECTFUL_EXACT</w:t>
+            </w:r>
+          </w:p>
+        </w:tc>
+        <w:tc>
+          <w:tcPr>
+            <w:tcW w:type="dxa" w:w="2290"/>
+          </w:tcPr>
+          <w:p>
+            <w:pPr>
+              <w:spacing w:before="0" w:after="0"/>
+            </w:pPr>
+            <w:r>
+              <w:rPr>
+                <w:sz w:val="8"/>
+              </w:rPr>
+              <w:t>POST /v1/outreach/companies/merge-preview</w:t>
+            </w:r>
+          </w:p>
+        </w:tc>
+        <w:tc>
+          <w:tcPr>
+            <w:tcW w:type="dxa" w:w="2290"/>
+          </w:tcPr>
+          <w:p>
+            <w:pPr>
+              <w:spacing w:before="0" w:after="0"/>
+            </w:pPr>
+            <w:r>
+              <w:rPr>
+                <w:sz w:val="8"/>
+              </w:rPr>
+              <w:t>BOUND_BY_BATCH_16</w:t>
+            </w:r>
+          </w:p>
+        </w:tc>
+      </w:tr>
+    </w:tbl>
     <w:sectPr>
-      <w:pgSz w:w="11906" w:h="16838" w:orient="landscape"/>
-      <w:pgMar w:top="605" w:right="605" w:bottom="605" w:left="605" w:header="283" w:footer="283" w:gutter="0"/>
+      <w:pgSz w:w="16838" w:h="11906" w:orient="landscape"/>
+      <w:pgMar w:top="475" w:right="403" w:bottom="475" w:left="403" w:header="283" w:footer="283" w:gutter="0"/>
       <w:cols w:space="720"/>
       <w:docGrid w:linePitch="360"/>
     </w:sectPr>

</xml_diff>

<commit_message>
docs(acpos): close final 20 definition binding gaps
</commit_message>
<xml_diff>
--- a/ACPOS_DEV-01_企業自動開發系統_Mother_Basic_Design_OPTIMIZED.docx
+++ b/ACPOS_DEV-01_企業自動開發系統_Mother_Basic_Design_OPTIMIZED.docx
@@ -26528,8 +26528,355 @@
         </w:tc>
       </w:tr>
     </w:tbl>
+    <w:p>
+      <w:pPr>
+        <w:sectPr>
+          <w:pgSz w:w="16838" w:h="11906" w:orient="landscape"/>
+          <w:pgMar w:top="475" w:right="403" w:bottom="475" w:left="403" w:header="283" w:footer="283" w:gutter="0"/>
+          <w:cols w:space="720"/>
+          <w:docGrid w:linePitch="360"/>
+        </w:sectPr>
+      </w:pPr>
+    </w:p>
+    <w:p>
+      <w:pPr>
+        <w:pStyle w:val="Heading1"/>
+      </w:pPr>
+      <w:r>
+        <w:t>Batch 17 · DEV Local Stage Permission Applicability Ledger</w:t>
+      </w:r>
+    </w:p>
+    <w:p>
+      <w:r>
+        <w:rPr>
+          <w:b/>
+        </w:rPr>
+        <w:t xml:space="preserve">[ACPOS-20260921-BATCH-17-REMAINING-DEFINITION-CLOSURE-V1::PAGE::DEV-01] </w:t>
+      </w:r>
+      <w:r>
+        <w:t>The existing five Permission cells remain '—'. This ledger makes the non-applicability explicit; it does not create a new authorization resource.</w:t>
+      </w:r>
+    </w:p>
+    <w:tbl>
+      <w:tblPr>
+        <w:tblStyle w:val="TableGrid"/>
+        <w:tblW w:type="auto" w:w="0"/>
+        <w:tblLook w:firstColumn="1" w:firstRow="1" w:lastColumn="0" w:lastRow="0" w:noHBand="0" w:noVBand="1" w:val="04A0"/>
+      </w:tblPr>
+      <w:tblGrid>
+        <w:gridCol w:w="3700"/>
+        <w:gridCol w:w="3700"/>
+        <w:gridCol w:w="3700"/>
+      </w:tblGrid>
+      <w:tr>
+        <w:trPr>
+          <w:tblHeader w:val="true"/>
+        </w:trPr>
+        <w:tc>
+          <w:tcPr>
+            <w:tcW w:type="dxa" w:w="3700"/>
+            <w:shd w:fill="EDE9FE"/>
+          </w:tcPr>
+          <w:p>
+            <w:pPr>
+              <w:spacing w:before="0" w:after="0"/>
+            </w:pPr>
+            <w:r>
+              <w:rPr>
+                <w:sz w:val="9"/>
+              </w:rPr>
+              <w:t>Target UID</w:t>
+            </w:r>
+          </w:p>
+        </w:tc>
+        <w:tc>
+          <w:tcPr>
+            <w:tcW w:type="dxa" w:w="3700"/>
+            <w:shd w:fill="EDE9FE"/>
+          </w:tcPr>
+          <w:p>
+            <w:pPr>
+              <w:spacing w:before="0" w:after="0"/>
+            </w:pPr>
+            <w:r>
+              <w:rPr>
+                <w:sz w:val="9"/>
+              </w:rPr>
+              <w:t>Permission Cell</w:t>
+            </w:r>
+          </w:p>
+        </w:tc>
+        <w:tc>
+          <w:tcPr>
+            <w:tcW w:type="dxa" w:w="3700"/>
+            <w:shd w:fill="EDE9FE"/>
+          </w:tcPr>
+          <w:p>
+            <w:pPr>
+              <w:spacing w:before="0" w:after="0"/>
+            </w:pPr>
+            <w:r>
+              <w:rPr>
+                <w:sz w:val="9"/>
+              </w:rPr>
+              <w:t>Handling</w:t>
+            </w:r>
+          </w:p>
+        </w:tc>
+      </w:tr>
+      <w:tr>
+        <w:tc>
+          <w:tcPr>
+            <w:tcW w:type="dxa" w:w="3700"/>
+          </w:tcPr>
+          <w:p>
+            <w:pPr>
+              <w:spacing w:before="0" w:after="0"/>
+            </w:pPr>
+            <w:r>
+              <w:rPr>
+                <w:sz w:val="9"/>
+              </w:rPr>
+              <w:t>DEV-01-BTN-STAGE-1</w:t>
+            </w:r>
+          </w:p>
+        </w:tc>
+        <w:tc>
+          <w:tcPr>
+            <w:tcW w:type="dxa" w:w="3700"/>
+          </w:tcPr>
+          <w:p>
+            <w:pPr>
+              <w:spacing w:before="0" w:after="0"/>
+            </w:pPr>
+            <w:r>
+              <w:rPr>
+                <w:sz w:val="9"/>
+              </w:rPr>
+              <w:t>—</w:t>
+            </w:r>
+          </w:p>
+        </w:tc>
+        <w:tc>
+          <w:tcPr>
+            <w:tcW w:type="dxa" w:w="3700"/>
+          </w:tcPr>
+          <w:p>
+            <w:pPr>
+              <w:spacing w:before="0" w:after="0"/>
+            </w:pPr>
+            <w:r>
+              <w:rPr>
+                <w:sz w:val="9"/>
+              </w:rPr>
+              <w:t>LEGITIMATE_NA_DEV_LOCAL_STAGE_PERMISSION</w:t>
+            </w:r>
+          </w:p>
+        </w:tc>
+      </w:tr>
+      <w:tr>
+        <w:tc>
+          <w:tcPr>
+            <w:tcW w:type="dxa" w:w="3700"/>
+          </w:tcPr>
+          <w:p>
+            <w:pPr>
+              <w:spacing w:before="0" w:after="0"/>
+            </w:pPr>
+            <w:r>
+              <w:rPr>
+                <w:sz w:val="9"/>
+              </w:rPr>
+              <w:t>DEV-01-BTN-STAGE-2</w:t>
+            </w:r>
+          </w:p>
+        </w:tc>
+        <w:tc>
+          <w:tcPr>
+            <w:tcW w:type="dxa" w:w="3700"/>
+          </w:tcPr>
+          <w:p>
+            <w:pPr>
+              <w:spacing w:before="0" w:after="0"/>
+            </w:pPr>
+            <w:r>
+              <w:rPr>
+                <w:sz w:val="9"/>
+              </w:rPr>
+              <w:t>—</w:t>
+            </w:r>
+          </w:p>
+        </w:tc>
+        <w:tc>
+          <w:tcPr>
+            <w:tcW w:type="dxa" w:w="3700"/>
+          </w:tcPr>
+          <w:p>
+            <w:pPr>
+              <w:spacing w:before="0" w:after="0"/>
+            </w:pPr>
+            <w:r>
+              <w:rPr>
+                <w:sz w:val="9"/>
+              </w:rPr>
+              <w:t>LEGITIMATE_NA_DEV_LOCAL_STAGE_PERMISSION</w:t>
+            </w:r>
+          </w:p>
+        </w:tc>
+      </w:tr>
+      <w:tr>
+        <w:tc>
+          <w:tcPr>
+            <w:tcW w:type="dxa" w:w="3700"/>
+          </w:tcPr>
+          <w:p>
+            <w:pPr>
+              <w:spacing w:before="0" w:after="0"/>
+            </w:pPr>
+            <w:r>
+              <w:rPr>
+                <w:sz w:val="9"/>
+              </w:rPr>
+              <w:t>DEV-01-BTN-STAGE-3</w:t>
+            </w:r>
+          </w:p>
+        </w:tc>
+        <w:tc>
+          <w:tcPr>
+            <w:tcW w:type="dxa" w:w="3700"/>
+          </w:tcPr>
+          <w:p>
+            <w:pPr>
+              <w:spacing w:before="0" w:after="0"/>
+            </w:pPr>
+            <w:r>
+              <w:rPr>
+                <w:sz w:val="9"/>
+              </w:rPr>
+              <w:t>—</w:t>
+            </w:r>
+          </w:p>
+        </w:tc>
+        <w:tc>
+          <w:tcPr>
+            <w:tcW w:type="dxa" w:w="3700"/>
+          </w:tcPr>
+          <w:p>
+            <w:pPr>
+              <w:spacing w:before="0" w:after="0"/>
+            </w:pPr>
+            <w:r>
+              <w:rPr>
+                <w:sz w:val="9"/>
+              </w:rPr>
+              <w:t>LEGITIMATE_NA_DEV_LOCAL_STAGE_PERMISSION</w:t>
+            </w:r>
+          </w:p>
+        </w:tc>
+      </w:tr>
+      <w:tr>
+        <w:tc>
+          <w:tcPr>
+            <w:tcW w:type="dxa" w:w="3700"/>
+          </w:tcPr>
+          <w:p>
+            <w:pPr>
+              <w:spacing w:before="0" w:after="0"/>
+            </w:pPr>
+            <w:r>
+              <w:rPr>
+                <w:sz w:val="9"/>
+              </w:rPr>
+              <w:t>DEV-01-BTN-STAGE-4</w:t>
+            </w:r>
+          </w:p>
+        </w:tc>
+        <w:tc>
+          <w:tcPr>
+            <w:tcW w:type="dxa" w:w="3700"/>
+          </w:tcPr>
+          <w:p>
+            <w:pPr>
+              <w:spacing w:before="0" w:after="0"/>
+            </w:pPr>
+            <w:r>
+              <w:rPr>
+                <w:sz w:val="9"/>
+              </w:rPr>
+              <w:t>—</w:t>
+            </w:r>
+          </w:p>
+        </w:tc>
+        <w:tc>
+          <w:tcPr>
+            <w:tcW w:type="dxa" w:w="3700"/>
+          </w:tcPr>
+          <w:p>
+            <w:pPr>
+              <w:spacing w:before="0" w:after="0"/>
+            </w:pPr>
+            <w:r>
+              <w:rPr>
+                <w:sz w:val="9"/>
+              </w:rPr>
+              <w:t>LEGITIMATE_NA_DEV_LOCAL_STAGE_PERMISSION</w:t>
+            </w:r>
+          </w:p>
+        </w:tc>
+      </w:tr>
+      <w:tr>
+        <w:tc>
+          <w:tcPr>
+            <w:tcW w:type="dxa" w:w="3700"/>
+          </w:tcPr>
+          <w:p>
+            <w:pPr>
+              <w:spacing w:before="0" w:after="0"/>
+            </w:pPr>
+            <w:r>
+              <w:rPr>
+                <w:sz w:val="9"/>
+              </w:rPr>
+              <w:t>DEV-01-BTN-STAGE-5</w:t>
+            </w:r>
+          </w:p>
+        </w:tc>
+        <w:tc>
+          <w:tcPr>
+            <w:tcW w:type="dxa" w:w="3700"/>
+          </w:tcPr>
+          <w:p>
+            <w:pPr>
+              <w:spacing w:before="0" w:after="0"/>
+            </w:pPr>
+            <w:r>
+              <w:rPr>
+                <w:sz w:val="9"/>
+              </w:rPr>
+              <w:t>—</w:t>
+            </w:r>
+          </w:p>
+        </w:tc>
+        <w:tc>
+          <w:tcPr>
+            <w:tcW w:type="dxa" w:w="3700"/>
+          </w:tcPr>
+          <w:p>
+            <w:pPr>
+              <w:spacing w:before="0" w:after="0"/>
+            </w:pPr>
+            <w:r>
+              <w:rPr>
+                <w:sz w:val="9"/>
+              </w:rPr>
+              <w:t>LEGITIMATE_NA_DEV_LOCAL_STAGE_PERMISSION</w:t>
+            </w:r>
+          </w:p>
+        </w:tc>
+      </w:tr>
+    </w:tbl>
     <w:sectPr>
-      <w:pgSz w:w="16838" w:h="11906" w:orient="landscape"/>
+      <w:pgSz w:w="11906" w:h="16838" w:orient="landscape"/>
       <w:pgMar w:top="475" w:right="403" w:bottom="475" w:left="403" w:header="283" w:footer="283" w:gutter="0"/>
       <w:cols w:space="720"/>
       <w:docGrid w:linePitch="360"/>

</xml_diff>

<commit_message>
docs(acpos): close system06 enterprise erp contract gaps
</commit_message>
<xml_diff>
--- a/ACPOS_DEV-01_企業自動開發系統_Mother_Basic_Design_OPTIMIZED.docx
+++ b/ACPOS_DEV-01_企業自動開發系統_Mother_Basic_Design_OPTIMIZED.docx
@@ -21059,10 +21059,20 @@
           </w:tcPr>
           <w:p>
             <w:r>
+              <w:t>ApproveOutreachCampaignRequest</w:t>
+            </w:r>
+          </w:p>
+        </w:tc>
+        <w:tc>
+          <w:tcPr>
+            <w:tcW w:type="dxa" w:w="1218"/>
+          </w:tcPr>
+          <w:p>
+            <w:r>
               <w:rPr>
                 <w:sz w:val="10"/>
               </w:rPr>
-              <w:t>—</w:t>
+              <w:t>approveOutreachCampaign</w:t>
             </w:r>
           </w:p>
         </w:tc>
@@ -21075,7 +21085,7 @@
               <w:rPr>
                 <w:sz w:val="10"/>
               </w:rPr>
-              <w:t>approveOutreachCampaign</w:t>
+              <w:t>POST /v1/outreach/campaigns/{campaignId}/approve</w:t>
             </w:r>
           </w:p>
         </w:tc>
@@ -21085,10 +21095,7 @@
           </w:tcPr>
           <w:p>
             <w:r>
-              <w:rPr>
-                <w:sz w:val="10"/>
-              </w:rPr>
-              <w:t>POST /v1/outreach/campaigns/{campaignId}/approve</w:t>
+              <w:t>Existing outreach owner</w:t>
             </w:r>
           </w:p>
         </w:tc>
@@ -21098,20 +21105,7 @@
           </w:tcPr>
           <w:p>
             <w:r>
-              <w:t>Existing outreach owner</w:t>
-            </w:r>
-          </w:p>
-        </w:tc>
-        <w:tc>
-          <w:tcPr>
-            <w:tcW w:type="dxa" w:w="1218"/>
-          </w:tcPr>
-          <w:p>
-            <w:r>
-              <w:rPr>
-                <w:sz w:val="10"/>
-              </w:rPr>
-              <w:t>—</w:t>
+              <w:t>Existing Outreach Owner / CampaignApproval + Campaign Audit</w:t>
             </w:r>
           </w:p>
         </w:tc>
@@ -21227,10 +21221,20 @@
           </w:tcPr>
           <w:p>
             <w:r>
+              <w:t>CreateOutreachCampaignRequest</w:t>
+            </w:r>
+          </w:p>
+        </w:tc>
+        <w:tc>
+          <w:tcPr>
+            <w:tcW w:type="dxa" w:w="1218"/>
+          </w:tcPr>
+          <w:p>
+            <w:r>
               <w:rPr>
                 <w:sz w:val="10"/>
               </w:rPr>
-              <w:t>—</w:t>
+              <w:t>createOutreachCampaign</w:t>
             </w:r>
           </w:p>
         </w:tc>
@@ -21243,7 +21247,7 @@
               <w:rPr>
                 <w:sz w:val="10"/>
               </w:rPr>
-              <w:t>createOutreachCampaign</w:t>
+              <w:t>POST /v1/outreach/campaigns</w:t>
             </w:r>
           </w:p>
         </w:tc>
@@ -21253,10 +21257,7 @@
           </w:tcPr>
           <w:p>
             <w:r>
-              <w:rPr>
-                <w:sz w:val="10"/>
-              </w:rPr>
-              <w:t>POST /v1/outreach/campaigns</w:t>
+              <w:t>INFO_COMMAND_RUNTIME</w:t>
             </w:r>
           </w:p>
         </w:tc>
@@ -21266,20 +21267,7 @@
           </w:tcPr>
           <w:p>
             <w:r>
-              <w:t>INFO_COMMAND_RUNTIME</w:t>
-            </w:r>
-          </w:p>
-        </w:tc>
-        <w:tc>
-          <w:tcPr>
-            <w:tcW w:type="dxa" w:w="1218"/>
-          </w:tcPr>
-          <w:p>
-            <w:r>
-              <w:rPr>
-                <w:sz w:val="10"/>
-              </w:rPr>
-              <w:t>—</w:t>
+              <w:t>Existing Outreach Owner / Campaign + Audit</w:t>
             </w:r>
           </w:p>
         </w:tc>
@@ -21395,10 +21383,20 @@
           </w:tcPr>
           <w:p>
             <w:r>
+              <w:t>SearchEnterpriseAudienceProjectionRequest</w:t>
+            </w:r>
+          </w:p>
+        </w:tc>
+        <w:tc>
+          <w:tcPr>
+            <w:tcW w:type="dxa" w:w="1218"/>
+          </w:tcPr>
+          <w:p>
+            <w:r>
               <w:rPr>
                 <w:sz w:val="10"/>
               </w:rPr>
-              <w:t>—</w:t>
+              <w:t>searchProjection</w:t>
             </w:r>
           </w:p>
         </w:tc>
@@ -21411,7 +21409,7 @@
               <w:rPr>
                 <w:sz w:val="10"/>
               </w:rPr>
-              <w:t>searchProjection</w:t>
+              <w:t>POST /v1/search</w:t>
             </w:r>
           </w:p>
         </w:tc>
@@ -21424,7 +21422,7 @@
               <w:rPr>
                 <w:sz w:val="10"/>
               </w:rPr>
-              <w:t>POST /v1/search</w:t>
+              <w:t>INFO_COMMAND_RUNTIME</w:t>
             </w:r>
           </w:p>
         </w:tc>
@@ -21434,23 +21432,7 @@
           </w:tcPr>
           <w:p>
             <w:r>
-              <w:rPr>
-                <w:sz w:val="10"/>
-              </w:rPr>
-              <w:t>INFO_COMMAND_RUNTIME</w:t>
-            </w:r>
-          </w:p>
-        </w:tc>
-        <w:tc>
-          <w:tcPr>
-            <w:tcW w:type="dxa" w:w="1218"/>
-          </w:tcPr>
-          <w:p>
-            <w:r>
-              <w:rPr>
-                <w:sz w:val="10"/>
-              </w:rPr>
-              <w:t>—</w:t>
+              <w:t>Global Brain / SemanticIndexResult + Search Audit</w:t>
             </w:r>
           </w:p>
         </w:tc>
@@ -21566,10 +21548,20 @@
           </w:tcPr>
           <w:p>
             <w:r>
+              <w:t>CreateEnterpriseCompanyCandidateRequest</w:t>
+            </w:r>
+          </w:p>
+        </w:tc>
+        <w:tc>
+          <w:tcPr>
+            <w:tcW w:type="dxa" w:w="1218"/>
+          </w:tcPr>
+          <w:p>
+            <w:r>
               <w:rPr>
                 <w:sz w:val="10"/>
               </w:rPr>
-              <w:t>—</w:t>
+              <w:t>createCandidate</w:t>
             </w:r>
           </w:p>
         </w:tc>
@@ -21582,7 +21574,7 @@
               <w:rPr>
                 <w:sz w:val="10"/>
               </w:rPr>
-              <w:t>createCandidate</w:t>
+              <w:t>POST /v1/candidates</w:t>
             </w:r>
           </w:p>
         </w:tc>
@@ -21592,10 +21584,7 @@
           </w:tcPr>
           <w:p>
             <w:r>
-              <w:rPr>
-                <w:sz w:val="10"/>
-              </w:rPr>
-              <w:t>POST /v1/candidates</w:t>
+              <w:t>Existing enterprise development owner</w:t>
             </w:r>
           </w:p>
         </w:tc>
@@ -21605,20 +21594,7 @@
           </w:tcPr>
           <w:p>
             <w:r>
-              <w:t>Existing enterprise development owner</w:t>
-            </w:r>
-          </w:p>
-        </w:tc>
-        <w:tc>
-          <w:tcPr>
-            <w:tcW w:type="dxa" w:w="1218"/>
-          </w:tcPr>
-          <w:p>
-            <w:r>
-              <w:rPr>
-                <w:sz w:val="10"/>
-              </w:rPr>
-              <w:t>—</w:t>
+              <w:t>Existing Enterprise Development Owner / CompanyCandidate + Evidence/Audit</w:t>
             </w:r>
           </w:p>
         </w:tc>
@@ -21734,10 +21710,7 @@
           </w:tcPr>
           <w:p>
             <w:r>
-              <w:rPr>
-                <w:sz w:val="10"/>
-              </w:rPr>
-              <w:t>—</w:t>
+              <w:t>DecideEnterpriseCandidateRequest</w:t>
             </w:r>
           </w:p>
         </w:tc>
@@ -21905,10 +21878,20 @@
           </w:tcPr>
           <w:p>
             <w:r>
+              <w:t>CreateEnterpriseChangeRequestRequest</w:t>
+            </w:r>
+          </w:p>
+        </w:tc>
+        <w:tc>
+          <w:tcPr>
+            <w:tcW w:type="dxa" w:w="1218"/>
+          </w:tcPr>
+          <w:p>
+            <w:r>
               <w:rPr>
                 <w:sz w:val="10"/>
               </w:rPr>
-              <w:t>—</w:t>
+              <w:t>createChangeRequest</w:t>
             </w:r>
           </w:p>
         </w:tc>
@@ -21921,7 +21904,7 @@
               <w:rPr>
                 <w:sz w:val="10"/>
               </w:rPr>
-              <w:t>createChangeRequest</w:t>
+              <w:t>POST /v1/change-requests</w:t>
             </w:r>
           </w:p>
         </w:tc>
@@ -21931,10 +21914,7 @@
           </w:tcPr>
           <w:p>
             <w:r>
-              <w:rPr>
-                <w:sz w:val="10"/>
-              </w:rPr>
-              <w:t>POST /v1/change-requests</w:t>
+              <w:t>CANDIDATE_DECISION_RUNTIME</w:t>
             </w:r>
           </w:p>
         </w:tc>
@@ -21944,20 +21924,7 @@
           </w:tcPr>
           <w:p>
             <w:r>
-              <w:t>CANDIDATE_DECISION_RUNTIME</w:t>
-            </w:r>
-          </w:p>
-        </w:tc>
-        <w:tc>
-          <w:tcPr>
-            <w:tcW w:type="dxa" w:w="1218"/>
-          </w:tcPr>
-          <w:p>
-            <w:r>
-              <w:rPr>
-                <w:sz w:val="10"/>
-              </w:rPr>
-              <w:t>—</w:t>
+              <w:t>Existing Governed Change Request Owner / ChangeRequest + Audit</w:t>
             </w:r>
           </w:p>
         </w:tc>
@@ -22073,10 +22040,20 @@
           </w:tcPr>
           <w:p>
             <w:r>
+              <w:t>SearchEnterpriseDirectoryProjectionRequest</w:t>
+            </w:r>
+          </w:p>
+        </w:tc>
+        <w:tc>
+          <w:tcPr>
+            <w:tcW w:type="dxa" w:w="1218"/>
+          </w:tcPr>
+          <w:p>
+            <w:r>
               <w:rPr>
                 <w:sz w:val="10"/>
               </w:rPr>
-              <w:t>—</w:t>
+              <w:t>searchProjection</w:t>
             </w:r>
           </w:p>
         </w:tc>
@@ -22089,7 +22066,7 @@
               <w:rPr>
                 <w:sz w:val="10"/>
               </w:rPr>
-              <w:t>searchProjection</w:t>
+              <w:t>POST /v1/search</w:t>
             </w:r>
           </w:p>
         </w:tc>
@@ -22102,7 +22079,7 @@
               <w:rPr>
                 <w:sz w:val="10"/>
               </w:rPr>
-              <w:t>POST /v1/search</w:t>
+              <w:t>INFO_COMMAND_RUNTIME</w:t>
             </w:r>
           </w:p>
         </w:tc>
@@ -22112,23 +22089,7 @@
           </w:tcPr>
           <w:p>
             <w:r>
-              <w:rPr>
-                <w:sz w:val="10"/>
-              </w:rPr>
-              <w:t>INFO_COMMAND_RUNTIME</w:t>
-            </w:r>
-          </w:p>
-        </w:tc>
-        <w:tc>
-          <w:tcPr>
-            <w:tcW w:type="dxa" w:w="1218"/>
-          </w:tcPr>
-          <w:p>
-            <w:r>
-              <w:rPr>
-                <w:sz w:val="10"/>
-              </w:rPr>
-              <w:t>—</w:t>
+              <w:t>Global Brain / SemanticIndexResult + Search Audit</w:t>
             </w:r>
           </w:p>
         </w:tc>
@@ -22244,10 +22205,20 @@
           </w:tcPr>
           <w:p>
             <w:r>
+              <w:t>PauseCompanyDiscoveryRequest</w:t>
+            </w:r>
+          </w:p>
+        </w:tc>
+        <w:tc>
+          <w:tcPr>
+            <w:tcW w:type="dxa" w:w="1218"/>
+          </w:tcPr>
+          <w:p>
+            <w:r>
               <w:rPr>
                 <w:sz w:val="10"/>
               </w:rPr>
-              <w:t>—</w:t>
+              <w:t>pauseCompanyDiscovery</w:t>
             </w:r>
           </w:p>
         </w:tc>
@@ -22260,7 +22231,7 @@
               <w:rPr>
                 <w:sz w:val="10"/>
               </w:rPr>
-              <w:t>pauseCompanyDiscovery</w:t>
+              <w:t>POST /v1/outreach/discovery-jobs/{jobId}/pause</w:t>
             </w:r>
           </w:p>
         </w:tc>
@@ -22270,10 +22241,7 @@
           </w:tcPr>
           <w:p>
             <w:r>
-              <w:rPr>
-                <w:sz w:val="10"/>
-              </w:rPr>
-              <w:t>POST /v1/outreach/discovery-jobs/{jobId}/pause</w:t>
+              <w:t>Shared Acquisition / Knowledge owner</w:t>
             </w:r>
           </w:p>
         </w:tc>
@@ -22283,20 +22251,7 @@
           </w:tcPr>
           <w:p>
             <w:r>
-              <w:t>Shared Acquisition / Knowledge owner</w:t>
-            </w:r>
-          </w:p>
-        </w:tc>
-        <w:tc>
-          <w:tcPr>
-            <w:tcW w:type="dxa" w:w="1218"/>
-          </w:tcPr>
-          <w:p>
-            <w:r>
-              <w:rPr>
-                <w:sz w:val="10"/>
-              </w:rPr>
-              <w:t>—</w:t>
+              <w:t>Shared Acquisition / Knowledge Owner / DiscoveryJob State + Audit</w:t>
             </w:r>
           </w:p>
         </w:tc>
@@ -22412,10 +22367,20 @@
           </w:tcPr>
           <w:p>
             <w:r>
+              <w:t>ResumeCompanyDiscoveryRequest</w:t>
+            </w:r>
+          </w:p>
+        </w:tc>
+        <w:tc>
+          <w:tcPr>
+            <w:tcW w:type="dxa" w:w="1218"/>
+          </w:tcPr>
+          <w:p>
+            <w:r>
               <w:rPr>
                 <w:sz w:val="10"/>
               </w:rPr>
-              <w:t>—</w:t>
+              <w:t>resumeCompanyDiscovery</w:t>
             </w:r>
           </w:p>
         </w:tc>
@@ -22428,7 +22393,7 @@
               <w:rPr>
                 <w:sz w:val="10"/>
               </w:rPr>
-              <w:t>resumeCompanyDiscovery</w:t>
+              <w:t>POST /v1/outreach/discovery-jobs/{jobId}/resume</w:t>
             </w:r>
           </w:p>
         </w:tc>
@@ -22438,10 +22403,7 @@
           </w:tcPr>
           <w:p>
             <w:r>
-              <w:rPr>
-                <w:sz w:val="10"/>
-              </w:rPr>
-              <w:t>POST /v1/outreach/discovery-jobs/{jobId}/resume</w:t>
+              <w:t>Shared Acquisition / Knowledge owner</w:t>
             </w:r>
           </w:p>
         </w:tc>
@@ -22451,20 +22413,7 @@
           </w:tcPr>
           <w:p>
             <w:r>
-              <w:t>Shared Acquisition / Knowledge owner</w:t>
-            </w:r>
-          </w:p>
-        </w:tc>
-        <w:tc>
-          <w:tcPr>
-            <w:tcW w:type="dxa" w:w="1218"/>
-          </w:tcPr>
-          <w:p>
-            <w:r>
-              <w:rPr>
-                <w:sz w:val="10"/>
-              </w:rPr>
-              <w:t>—</w:t>
+              <w:t>Shared Acquisition / Knowledge Owner / DiscoveryJob State + Audit</w:t>
             </w:r>
           </w:p>
         </w:tc>
@@ -22580,10 +22529,20 @@
           </w:tcPr>
           <w:p>
             <w:r>
+              <w:t>StartCompanyDiscoveryRequest</w:t>
+            </w:r>
+          </w:p>
+        </w:tc>
+        <w:tc>
+          <w:tcPr>
+            <w:tcW w:type="dxa" w:w="1218"/>
+          </w:tcPr>
+          <w:p>
+            <w:r>
               <w:rPr>
                 <w:sz w:val="10"/>
               </w:rPr>
-              <w:t>—</w:t>
+              <w:t>startCompanyDiscovery</w:t>
             </w:r>
           </w:p>
         </w:tc>
@@ -22596,7 +22555,7 @@
               <w:rPr>
                 <w:sz w:val="10"/>
               </w:rPr>
-              <w:t>startCompanyDiscovery</w:t>
+              <w:t>POST /v1/outreach/discovery-jobs</w:t>
             </w:r>
           </w:p>
         </w:tc>
@@ -22606,10 +22565,7 @@
           </w:tcPr>
           <w:p>
             <w:r>
-              <w:rPr>
-                <w:sz w:val="10"/>
-              </w:rPr>
-              <w:t>POST /v1/outreach/discovery-jobs</w:t>
+              <w:t>Shared Acquisition / Knowledge owner</w:t>
             </w:r>
           </w:p>
         </w:tc>
@@ -22619,20 +22575,7 @@
           </w:tcPr>
           <w:p>
             <w:r>
-              <w:t>Shared Acquisition / Knowledge owner</w:t>
-            </w:r>
-          </w:p>
-        </w:tc>
-        <w:tc>
-          <w:tcPr>
-            <w:tcW w:type="dxa" w:w="1218"/>
-          </w:tcPr>
-          <w:p>
-            <w:r>
-              <w:rPr>
-                <w:sz w:val="10"/>
-              </w:rPr>
-              <w:t>—</w:t>
+              <w:t>Shared Acquisition / Knowledge Owner / DiscoveryJob + Audit</w:t>
             </w:r>
           </w:p>
         </w:tc>
@@ -22748,10 +22691,20 @@
           </w:tcPr>
           <w:p>
             <w:r>
+              <w:t>StopCompanyDiscoveryRequest</w:t>
+            </w:r>
+          </w:p>
+        </w:tc>
+        <w:tc>
+          <w:tcPr>
+            <w:tcW w:type="dxa" w:w="1218"/>
+          </w:tcPr>
+          <w:p>
+            <w:r>
               <w:rPr>
                 <w:sz w:val="10"/>
               </w:rPr>
-              <w:t>—</w:t>
+              <w:t>stopCompanyDiscovery</w:t>
             </w:r>
           </w:p>
         </w:tc>
@@ -22764,7 +22717,7 @@
               <w:rPr>
                 <w:sz w:val="10"/>
               </w:rPr>
-              <w:t>stopCompanyDiscovery</w:t>
+              <w:t>POST /v1/outreach/discovery-jobs/{jobId}/stop</w:t>
             </w:r>
           </w:p>
         </w:tc>
@@ -22774,10 +22727,7 @@
           </w:tcPr>
           <w:p>
             <w:r>
-              <w:rPr>
-                <w:sz w:val="10"/>
-              </w:rPr>
-              <w:t>POST /v1/outreach/discovery-jobs/{jobId}/stop</w:t>
+              <w:t>Shared Acquisition / Knowledge owner</w:t>
             </w:r>
           </w:p>
         </w:tc>
@@ -22787,20 +22737,7 @@
           </w:tcPr>
           <w:p>
             <w:r>
-              <w:t>Shared Acquisition / Knowledge owner</w:t>
-            </w:r>
-          </w:p>
-        </w:tc>
-        <w:tc>
-          <w:tcPr>
-            <w:tcW w:type="dxa" w:w="1218"/>
-          </w:tcPr>
-          <w:p>
-            <w:r>
-              <w:rPr>
-                <w:sz w:val="10"/>
-              </w:rPr>
-              <w:t>—</w:t>
+              <w:t>Shared Acquisition / Knowledge Owner / DiscoveryJob State + Audit</w:t>
             </w:r>
           </w:p>
         </w:tc>
@@ -22916,10 +22853,20 @@
           </w:tcPr>
           <w:p>
             <w:r>
+              <w:t>DispatchOutreachCampaignRequest</w:t>
+            </w:r>
+          </w:p>
+        </w:tc>
+        <w:tc>
+          <w:tcPr>
+            <w:tcW w:type="dxa" w:w="1218"/>
+          </w:tcPr>
+          <w:p>
+            <w:r>
               <w:rPr>
                 <w:sz w:val="10"/>
               </w:rPr>
-              <w:t>—</w:t>
+              <w:t>dispatchOutreachCampaign</w:t>
             </w:r>
           </w:p>
         </w:tc>
@@ -22932,7 +22879,7 @@
               <w:rPr>
                 <w:sz w:val="10"/>
               </w:rPr>
-              <w:t>dispatchOutreachCampaign</w:t>
+              <w:t>POST /v1/outreach/campaigns/{campaignId}/dispatch</w:t>
             </w:r>
           </w:p>
         </w:tc>
@@ -22942,10 +22889,7 @@
           </w:tcPr>
           <w:p>
             <w:r>
-              <w:rPr>
-                <w:sz w:val="10"/>
-              </w:rPr>
-              <w:t>POST /v1/outreach/campaigns/{campaignId}/dispatch</w:t>
+              <w:t>Existing outreach owner</w:t>
             </w:r>
           </w:p>
         </w:tc>
@@ -22955,20 +22899,7 @@
           </w:tcPr>
           <w:p>
             <w:r>
-              <w:t>Existing outreach owner</w:t>
-            </w:r>
-          </w:p>
-        </w:tc>
-        <w:tc>
-          <w:tcPr>
-            <w:tcW w:type="dxa" w:w="1218"/>
-          </w:tcPr>
-          <w:p>
-            <w:r>
-              <w:rPr>
-                <w:sz w:val="10"/>
-              </w:rPr>
-              <w:t>—</w:t>
+              <w:t>Existing Outreach Owner / Campaign Dispatch + IndividualDelivery + Audit</w:t>
             </w:r>
           </w:p>
         </w:tc>
@@ -23084,10 +23015,20 @@
           </w:tcPr>
           <w:p>
             <w:r>
+              <w:t>ExportEnterpriseProjectionRequest</w:t>
+            </w:r>
+          </w:p>
+        </w:tc>
+        <w:tc>
+          <w:tcPr>
+            <w:tcW w:type="dxa" w:w="1218"/>
+          </w:tcPr>
+          <w:p>
+            <w:r>
               <w:rPr>
                 <w:sz w:val="10"/>
               </w:rPr>
-              <w:t>—</w:t>
+              <w:t>exportProjection</w:t>
             </w:r>
           </w:p>
         </w:tc>
@@ -23100,7 +23041,7 @@
               <w:rPr>
                 <w:sz w:val="10"/>
               </w:rPr>
-              <w:t>exportProjection</w:t>
+              <w:t>POST /v1/exports</w:t>
             </w:r>
           </w:p>
         </w:tc>
@@ -23113,7 +23054,7 @@
               <w:rPr>
                 <w:sz w:val="10"/>
               </w:rPr>
-              <w:t>POST /v1/exports</w:t>
+              <w:t>INFO_COMMAND_RUNTIME</w:t>
             </w:r>
           </w:p>
         </w:tc>
@@ -23123,23 +23064,7 @@
           </w:tcPr>
           <w:p>
             <w:r>
-              <w:rPr>
-                <w:sz w:val="10"/>
-              </w:rPr>
-              <w:t>INFO_COMMAND_RUNTIME</w:t>
-            </w:r>
-          </w:p>
-        </w:tc>
-        <w:tc>
-          <w:tcPr>
-            <w:tcW w:type="dxa" w:w="1218"/>
-          </w:tcPr>
-          <w:p>
-            <w:r>
-              <w:rPr>
-                <w:sz w:val="10"/>
-              </w:rPr>
-              <w:t>—</w:t>
+              <w:t>Existing Projection/Export Owner / Enterprise Export Artifact + Export Audit</w:t>
             </w:r>
           </w:p>
         </w:tc>
@@ -23255,10 +23180,20 @@
           </w:tcPr>
           <w:p>
             <w:r>
+              <w:t>SetEnterpriseOutreachKillSwitchRequest</w:t>
+            </w:r>
+          </w:p>
+        </w:tc>
+        <w:tc>
+          <w:tcPr>
+            <w:tcW w:type="dxa" w:w="1218"/>
+          </w:tcPr>
+          <w:p>
+            <w:r>
               <w:rPr>
                 <w:sz w:val="10"/>
               </w:rPr>
-              <w:t>—</w:t>
+              <w:t>setKillSwitch</w:t>
             </w:r>
           </w:p>
         </w:tc>
@@ -23271,7 +23206,7 @@
               <w:rPr>
                 <w:sz w:val="10"/>
               </w:rPr>
-              <w:t>setKillSwitch</w:t>
+              <w:t>POST /v1/operations/kill-switch</w:t>
             </w:r>
           </w:p>
         </w:tc>
@@ -23284,7 +23219,7 @@
               <w:rPr>
                 <w:sz w:val="10"/>
               </w:rPr>
-              <w:t>POST /v1/operations/kill-switch</w:t>
+              <w:t>AIAPI_PROVIDER_COMMAND_RUNTIME</w:t>
             </w:r>
           </w:p>
         </w:tc>
@@ -23294,23 +23229,7 @@
           </w:tcPr>
           <w:p>
             <w:r>
-              <w:rPr>
-                <w:sz w:val="10"/>
-              </w:rPr>
-              <w:t>AIAPI_PROVIDER_COMMAND_RUNTIME</w:t>
-            </w:r>
-          </w:p>
-        </w:tc>
-        <w:tc>
-          <w:tcPr>
-            <w:tcW w:type="dxa" w:w="1218"/>
-          </w:tcPr>
-          <w:p>
-            <w:r>
-              <w:rPr>
-                <w:sz w:val="10"/>
-              </w:rPr>
-              <w:t>—</w:t>
+              <w:t>Existing Operations Governance / Kill Switch State + Audit</w:t>
             </w:r>
           </w:p>
         </w:tc>
@@ -23426,10 +23345,20 @@
           </w:tcPr>
           <w:p>
             <w:r>
+              <w:t>MergeCompanyCandidateRequest</w:t>
+            </w:r>
+          </w:p>
+        </w:tc>
+        <w:tc>
+          <w:tcPr>
+            <w:tcW w:type="dxa" w:w="1218"/>
+          </w:tcPr>
+          <w:p>
+            <w:r>
               <w:rPr>
                 <w:sz w:val="10"/>
               </w:rPr>
-              <w:t>—</w:t>
+              <w:t>mergeCompanyCandidate</w:t>
             </w:r>
           </w:p>
         </w:tc>
@@ -23442,7 +23371,7 @@
               <w:rPr>
                 <w:sz w:val="10"/>
               </w:rPr>
-              <w:t>mergeCompanyCandidate</w:t>
+              <w:t>POST /v1/outreach/companies/{companyId}/merge</w:t>
             </w:r>
           </w:p>
         </w:tc>
@@ -23452,10 +23381,7 @@
           </w:tcPr>
           <w:p>
             <w:r>
-              <w:rPr>
-                <w:sz w:val="10"/>
-              </w:rPr>
-              <w:t>POST /v1/outreach/companies/{companyId}/merge</w:t>
+              <w:t>Existing enterprise development owner</w:t>
             </w:r>
           </w:p>
         </w:tc>
@@ -23465,20 +23391,7 @@
           </w:tcPr>
           <w:p>
             <w:r>
-              <w:t>Existing enterprise development owner</w:t>
-            </w:r>
-          </w:p>
-        </w:tc>
-        <w:tc>
-          <w:tcPr>
-            <w:tcW w:type="dxa" w:w="1218"/>
-          </w:tcPr>
-          <w:p>
-            <w:r>
-              <w:rPr>
-                <w:sz w:val="10"/>
-              </w:rPr>
-              <w:t>—</w:t>
+              <w:t>Existing Enterprise Development Owner / CompanyMaster + CompanyMergeDecision + Lineage Audit</w:t>
             </w:r>
           </w:p>
         </w:tc>
@@ -23594,10 +23507,20 @@
           </w:tcPr>
           <w:p>
             <w:r>
+              <w:t>PreviewCompanyMergeRequest</w:t>
+            </w:r>
+          </w:p>
+        </w:tc>
+        <w:tc>
+          <w:tcPr>
+            <w:tcW w:type="dxa" w:w="1218"/>
+          </w:tcPr>
+          <w:p>
+            <w:r>
               <w:rPr>
                 <w:sz w:val="10"/>
               </w:rPr>
-              <w:t>—</w:t>
+              <w:t>previewCompanyMerge</w:t>
             </w:r>
           </w:p>
         </w:tc>
@@ -23610,7 +23533,7 @@
               <w:rPr>
                 <w:sz w:val="10"/>
               </w:rPr>
-              <w:t>previewCompanyMerge</w:t>
+              <w:t>POST /v1/outreach/companies/merge-preview</w:t>
             </w:r>
           </w:p>
         </w:tc>
@@ -23620,10 +23543,7 @@
           </w:tcPr>
           <w:p>
             <w:r>
-              <w:rPr>
-                <w:sz w:val="10"/>
-              </w:rPr>
-              <w:t>POST /v1/outreach/companies/merge-preview</w:t>
+              <w:t>Existing enterprise development owner</w:t>
             </w:r>
           </w:p>
         </w:tc>
@@ -23633,20 +23553,7 @@
           </w:tcPr>
           <w:p>
             <w:r>
-              <w:t>Existing enterprise development owner</w:t>
-            </w:r>
-          </w:p>
-        </w:tc>
-        <w:tc>
-          <w:tcPr>
-            <w:tcW w:type="dxa" w:w="1218"/>
-          </w:tcPr>
-          <w:p>
-            <w:r>
-              <w:rPr>
-                <w:sz w:val="10"/>
-              </w:rPr>
-              <w:t>—</w:t>
+              <w:t>Existing Enterprise Development Owner / CompanyMergeCandidate + Merge Preview Evidence</w:t>
             </w:r>
           </w:p>
         </w:tc>
@@ -23762,10 +23669,20 @@
           </w:tcPr>
           <w:p>
             <w:r>
+              <w:t>RefreshEnterpriseProjectionRequest</w:t>
+            </w:r>
+          </w:p>
+        </w:tc>
+        <w:tc>
+          <w:tcPr>
+            <w:tcW w:type="dxa" w:w="1218"/>
+          </w:tcPr>
+          <w:p>
+            <w:r>
               <w:rPr>
                 <w:sz w:val="10"/>
               </w:rPr>
-              <w:t>—</w:t>
+              <w:t>refreshProjection</w:t>
             </w:r>
           </w:p>
         </w:tc>
@@ -23778,7 +23695,7 @@
               <w:rPr>
                 <w:sz w:val="10"/>
               </w:rPr>
-              <w:t>refreshProjection</w:t>
+              <w:t>POST /v1/projections/refresh</w:t>
             </w:r>
           </w:p>
         </w:tc>
@@ -23791,7 +23708,7 @@
               <w:rPr>
                 <w:sz w:val="10"/>
               </w:rPr>
-              <w:t>POST /v1/projections/refresh</w:t>
+              <w:t>INFO_COMMAND_RUNTIME</w:t>
             </w:r>
           </w:p>
         </w:tc>
@@ -23801,23 +23718,7 @@
           </w:tcPr>
           <w:p>
             <w:r>
-              <w:rPr>
-                <w:sz w:val="10"/>
-              </w:rPr>
-              <w:t>INFO_COMMAND_RUNTIME</w:t>
-            </w:r>
-          </w:p>
-        </w:tc>
-        <w:tc>
-          <w:tcPr>
-            <w:tcW w:type="dxa" w:w="1218"/>
-          </w:tcPr>
-          <w:p>
-            <w:r>
-              <w:rPr>
-                <w:sz w:val="10"/>
-              </w:rPr>
-              <w:t>—</w:t>
+              <w:t>Global Brain / Enterprise Projection + Projection Audit</w:t>
             </w:r>
           </w:p>
         </w:tc>
@@ -26875,8 +26776,1535 @@
         </w:tc>
       </w:tr>
     </w:tbl>
+    <w:p>
+      <w:pPr>
+        <w:sectPr>
+          <w:pgSz w:w="11906" w:h="16838" w:orient="landscape"/>
+          <w:pgMar w:top="475" w:right="403" w:bottom="475" w:left="403" w:header="283" w:footer="283" w:gutter="0"/>
+          <w:cols w:space="720"/>
+          <w:docGrid w:linePitch="360"/>
+        </w:sectPr>
+      </w:pPr>
+    </w:p>
+    <w:p>
+      <w:pPr>
+        <w:pStyle w:val="Heading1"/>
+      </w:pPr>
+      <w:r>
+        <w:t>Batch 49 · DEV-01 Enterprise Contract Binding Ledger</w:t>
+      </w:r>
+    </w:p>
+    <w:p>
+      <w:r>
+        <w:rPr>
+          <w:b/>
+        </w:rPr>
+        <w:t xml:space="preserve">[ACPOS-20260922-BATCH-49-SYSTEM06-ENTERPRISE-ERP-CONTRACT-REMEDIATION-V1::PAGE::DEV-01] </w:t>
+      </w:r>
+      <w:r>
+        <w:t>These bindings close only Payload/Schema and Persistence Owner gaps. Existing Method/Path, Action, Gate, Permission, Runtime Owner and Runtime Status remain unchanged. Projection/search/export state stays derived; enterprise canonical entities reuse their existing owners; ERP connector secrets remain references only; no Production/provider execution is claimed.</w:t>
+      </w:r>
+    </w:p>
+    <w:tbl>
+      <w:tblPr>
+        <w:tblStyle w:val="TableGrid"/>
+        <w:tblW w:type="auto" w:w="0"/>
+        <w:tblLook w:firstColumn="1" w:firstRow="1" w:lastColumn="0" w:lastRow="0" w:noHBand="0" w:noVBand="1" w:val="04A0"/>
+      </w:tblPr>
+      <w:tblGrid>
+        <w:gridCol w:w="3206"/>
+        <w:gridCol w:w="3206"/>
+        <w:gridCol w:w="3206"/>
+        <w:gridCol w:w="3206"/>
+        <w:gridCol w:w="3206"/>
+      </w:tblGrid>
+      <w:tr>
+        <w:trPr>
+          <w:tblHeader w:val="true"/>
+        </w:trPr>
+        <w:tc>
+          <w:tcPr>
+            <w:tcW w:type="dxa" w:w="3206"/>
+            <w:shd w:fill="EDE9FE"/>
+          </w:tcPr>
+          <w:p>
+            <w:pPr>
+              <w:spacing w:before="0" w:after="0"/>
+            </w:pPr>
+            <w:r>
+              <w:rPr>
+                <w:sz w:val="7"/>
+              </w:rPr>
+              <w:t>Control UID</w:t>
+            </w:r>
+          </w:p>
+        </w:tc>
+        <w:tc>
+          <w:tcPr>
+            <w:tcW w:type="dxa" w:w="3206"/>
+            <w:shd w:fill="EDE9FE"/>
+          </w:tcPr>
+          <w:p>
+            <w:pPr>
+              <w:spacing w:before="0" w:after="0"/>
+            </w:pPr>
+            <w:r>
+              <w:rPr>
+                <w:sz w:val="7"/>
+              </w:rPr>
+              <w:t>Operation</w:t>
+            </w:r>
+          </w:p>
+        </w:tc>
+        <w:tc>
+          <w:tcPr>
+            <w:tcW w:type="dxa" w:w="3206"/>
+            <w:shd w:fill="EDE9FE"/>
+          </w:tcPr>
+          <w:p>
+            <w:pPr>
+              <w:spacing w:before="0" w:after="0"/>
+            </w:pPr>
+            <w:r>
+              <w:rPr>
+                <w:sz w:val="7"/>
+              </w:rPr>
+              <w:t>Payload / Schema</w:t>
+            </w:r>
+          </w:p>
+        </w:tc>
+        <w:tc>
+          <w:tcPr>
+            <w:tcW w:type="dxa" w:w="3206"/>
+            <w:shd w:fill="EDE9FE"/>
+          </w:tcPr>
+          <w:p>
+            <w:pPr>
+              <w:spacing w:before="0" w:after="0"/>
+            </w:pPr>
+            <w:r>
+              <w:rPr>
+                <w:sz w:val="7"/>
+              </w:rPr>
+              <w:t>Persistence Owner</w:t>
+            </w:r>
+          </w:p>
+        </w:tc>
+        <w:tc>
+          <w:tcPr>
+            <w:tcW w:type="dxa" w:w="3206"/>
+            <w:shd w:fill="EDE9FE"/>
+          </w:tcPr>
+          <w:p>
+            <w:pPr>
+              <w:spacing w:before="0" w:after="0"/>
+            </w:pPr>
+            <w:r>
+              <w:rPr>
+                <w:sz w:val="7"/>
+              </w:rPr>
+              <w:t>Required Semantics</w:t>
+            </w:r>
+          </w:p>
+        </w:tc>
+      </w:tr>
+      <w:tr>
+        <w:tc>
+          <w:tcPr>
+            <w:tcW w:type="dxa" w:w="3206"/>
+          </w:tcPr>
+          <w:p>
+            <w:pPr>
+              <w:spacing w:before="0" w:after="0"/>
+            </w:pPr>
+            <w:r>
+              <w:rPr>
+                <w:sz w:val="7"/>
+              </w:rPr>
+              <w:t>DEV-01-BTN-CAMPAIGN-APPROVE</w:t>
+            </w:r>
+          </w:p>
+        </w:tc>
+        <w:tc>
+          <w:tcPr>
+            <w:tcW w:type="dxa" w:w="3206"/>
+          </w:tcPr>
+          <w:p>
+            <w:pPr>
+              <w:spacing w:before="0" w:after="0"/>
+            </w:pPr>
+            <w:r>
+              <w:rPr>
+                <w:sz w:val="7"/>
+              </w:rPr>
+              <w:t>approveOutreachCampaign</w:t>
+            </w:r>
+          </w:p>
+        </w:tc>
+        <w:tc>
+          <w:tcPr>
+            <w:tcW w:type="dxa" w:w="3206"/>
+          </w:tcPr>
+          <w:p>
+            <w:pPr>
+              <w:spacing w:before="0" w:after="0"/>
+            </w:pPr>
+            <w:r>
+              <w:rPr>
+                <w:sz w:val="7"/>
+              </w:rPr>
+              <w:t>ApproveOutreachCampaignRequest</w:t>
+            </w:r>
+          </w:p>
+        </w:tc>
+        <w:tc>
+          <w:tcPr>
+            <w:tcW w:type="dxa" w:w="3206"/>
+          </w:tcPr>
+          <w:p>
+            <w:pPr>
+              <w:spacing w:before="0" w:after="0"/>
+            </w:pPr>
+            <w:r>
+              <w:rPr>
+                <w:sz w:val="7"/>
+              </w:rPr>
+              <w:t>Existing Outreach Owner / CampaignApproval + Campaign Audit</w:t>
+            </w:r>
+          </w:p>
+        </w:tc>
+        <w:tc>
+          <w:tcPr>
+            <w:tcW w:type="dxa" w:w="3206"/>
+          </w:tcPr>
+          <w:p>
+            <w:pPr>
+              <w:spacing w:before="0" w:after="0"/>
+            </w:pPr>
+            <w:r>
+              <w:rPr>
+                <w:sz w:val="7"/>
+              </w:rPr>
+              <w:t>Approval is distinct from dispatch. The exact Campaign/version/recipient refs and reviewer authority must resolve before approval is persisted.</w:t>
+            </w:r>
+          </w:p>
+        </w:tc>
+      </w:tr>
+      <w:tr>
+        <w:tc>
+          <w:tcPr>
+            <w:tcW w:type="dxa" w:w="3206"/>
+          </w:tcPr>
+          <w:p>
+            <w:pPr>
+              <w:spacing w:before="0" w:after="0"/>
+            </w:pPr>
+            <w:r>
+              <w:rPr>
+                <w:sz w:val="7"/>
+              </w:rPr>
+              <w:t>DEV-01-BTN-CAMPAIGN-CREATE</w:t>
+            </w:r>
+          </w:p>
+        </w:tc>
+        <w:tc>
+          <w:tcPr>
+            <w:tcW w:type="dxa" w:w="3206"/>
+          </w:tcPr>
+          <w:p>
+            <w:pPr>
+              <w:spacing w:before="0" w:after="0"/>
+            </w:pPr>
+            <w:r>
+              <w:rPr>
+                <w:sz w:val="7"/>
+              </w:rPr>
+              <w:t>createOutreachCampaign</w:t>
+            </w:r>
+          </w:p>
+        </w:tc>
+        <w:tc>
+          <w:tcPr>
+            <w:tcW w:type="dxa" w:w="3206"/>
+          </w:tcPr>
+          <w:p>
+            <w:pPr>
+              <w:spacing w:before="0" w:after="0"/>
+            </w:pPr>
+            <w:r>
+              <w:rPr>
+                <w:sz w:val="7"/>
+              </w:rPr>
+              <w:t>CreateOutreachCampaignRequest</w:t>
+            </w:r>
+          </w:p>
+        </w:tc>
+        <w:tc>
+          <w:tcPr>
+            <w:tcW w:type="dxa" w:w="3206"/>
+          </w:tcPr>
+          <w:p>
+            <w:pPr>
+              <w:spacing w:before="0" w:after="0"/>
+            </w:pPr>
+            <w:r>
+              <w:rPr>
+                <w:sz w:val="7"/>
+              </w:rPr>
+              <w:t>Existing Outreach Owner / Campaign + Audit</w:t>
+            </w:r>
+          </w:p>
+        </w:tc>
+        <w:tc>
+          <w:tcPr>
+            <w:tcW w:type="dxa" w:w="3206"/>
+          </w:tcPr>
+          <w:p>
+            <w:pPr>
+              <w:spacing w:before="0" w:after="0"/>
+            </w:pPr>
+            <w:r>
+              <w:rPr>
+                <w:sz w:val="7"/>
+              </w:rPr>
+              <w:t>Campaign persists an exact recipient_ref set, message/sender/schedule refs and governance metadata. Search/filter text is never itself the audience.</w:t>
+            </w:r>
+          </w:p>
+        </w:tc>
+      </w:tr>
+      <w:tr>
+        <w:tc>
+          <w:tcPr>
+            <w:tcW w:type="dxa" w:w="3206"/>
+          </w:tcPr>
+          <w:p>
+            <w:pPr>
+              <w:spacing w:before="0" w:after="0"/>
+            </w:pPr>
+            <w:r>
+              <w:rPr>
+                <w:sz w:val="7"/>
+              </w:rPr>
+              <w:t>DEV-01-BTN-CAMPAIGN-SEARCH</w:t>
+            </w:r>
+          </w:p>
+        </w:tc>
+        <w:tc>
+          <w:tcPr>
+            <w:tcW w:type="dxa" w:w="3206"/>
+          </w:tcPr>
+          <w:p>
+            <w:pPr>
+              <w:spacing w:before="0" w:after="0"/>
+            </w:pPr>
+            <w:r>
+              <w:rPr>
+                <w:sz w:val="7"/>
+              </w:rPr>
+              <w:t>searchProjection</w:t>
+            </w:r>
+          </w:p>
+        </w:tc>
+        <w:tc>
+          <w:tcPr>
+            <w:tcW w:type="dxa" w:w="3206"/>
+          </w:tcPr>
+          <w:p>
+            <w:pPr>
+              <w:spacing w:before="0" w:after="0"/>
+            </w:pPr>
+            <w:r>
+              <w:rPr>
+                <w:sz w:val="7"/>
+              </w:rPr>
+              <w:t>SearchEnterpriseAudienceProjectionRequest</w:t>
+            </w:r>
+          </w:p>
+        </w:tc>
+        <w:tc>
+          <w:tcPr>
+            <w:tcW w:type="dxa" w:w="3206"/>
+          </w:tcPr>
+          <w:p>
+            <w:pPr>
+              <w:spacing w:before="0" w:after="0"/>
+            </w:pPr>
+            <w:r>
+              <w:rPr>
+                <w:sz w:val="7"/>
+              </w:rPr>
+              <w:t>Global Brain / SemanticIndexResult + Search Audit</w:t>
+            </w:r>
+          </w:p>
+        </w:tc>
+        <w:tc>
+          <w:tcPr>
+            <w:tcW w:type="dxa" w:w="3206"/>
+          </w:tcPr>
+          <w:p>
+            <w:pPr>
+              <w:spacing w:before="0" w:after="0"/>
+            </w:pPr>
+            <w:r>
+              <w:rPr>
+                <w:sz w:val="7"/>
+              </w:rPr>
+              <w:t>Audience search persists derived search/index result pointers and scope only; it must dereference exact source/evidence and never create a second Company/Audience truth store.</w:t>
+            </w:r>
+          </w:p>
+        </w:tc>
+      </w:tr>
+      <w:tr>
+        <w:tc>
+          <w:tcPr>
+            <w:tcW w:type="dxa" w:w="3206"/>
+          </w:tcPr>
+          <w:p>
+            <w:pPr>
+              <w:spacing w:before="0" w:after="0"/>
+            </w:pPr>
+            <w:r>
+              <w:rPr>
+                <w:sz w:val="7"/>
+              </w:rPr>
+              <w:t>DEV-01-BTN-CANDIDATE-CREATE</w:t>
+            </w:r>
+          </w:p>
+        </w:tc>
+        <w:tc>
+          <w:tcPr>
+            <w:tcW w:type="dxa" w:w="3206"/>
+          </w:tcPr>
+          <w:p>
+            <w:pPr>
+              <w:spacing w:before="0" w:after="0"/>
+            </w:pPr>
+            <w:r>
+              <w:rPr>
+                <w:sz w:val="7"/>
+              </w:rPr>
+              <w:t>createCandidate</w:t>
+            </w:r>
+          </w:p>
+        </w:tc>
+        <w:tc>
+          <w:tcPr>
+            <w:tcW w:type="dxa" w:w="3206"/>
+          </w:tcPr>
+          <w:p>
+            <w:pPr>
+              <w:spacing w:before="0" w:after="0"/>
+            </w:pPr>
+            <w:r>
+              <w:rPr>
+                <w:sz w:val="7"/>
+              </w:rPr>
+              <w:t>CreateEnterpriseCompanyCandidateRequest</w:t>
+            </w:r>
+          </w:p>
+        </w:tc>
+        <w:tc>
+          <w:tcPr>
+            <w:tcW w:type="dxa" w:w="3206"/>
+          </w:tcPr>
+          <w:p>
+            <w:pPr>
+              <w:spacing w:before="0" w:after="0"/>
+            </w:pPr>
+            <w:r>
+              <w:rPr>
+                <w:sz w:val="7"/>
+              </w:rPr>
+              <w:t>Existing Enterprise Development Owner / CompanyCandidate + Evidence/Audit</w:t>
+            </w:r>
+          </w:p>
+        </w:tc>
+        <w:tc>
+          <w:tcPr>
+            <w:tcW w:type="dxa" w:w="3206"/>
+          </w:tcPr>
+          <w:p>
+            <w:pPr>
+              <w:spacing w:before="0" w:after="0"/>
+            </w:pPr>
+            <w:r>
+              <w:rPr>
+                <w:sz w:val="7"/>
+              </w:rPr>
+              <w:t>Candidate creation records unresolved company evidence under the existing enterprise owner. Candidate is not CompanyMaster and cannot bypass identity resolution.</w:t>
+            </w:r>
+          </w:p>
+        </w:tc>
+      </w:tr>
+      <w:tr>
+        <w:tc>
+          <w:tcPr>
+            <w:tcW w:type="dxa" w:w="3206"/>
+          </w:tcPr>
+          <w:p>
+            <w:pPr>
+              <w:spacing w:before="0" w:after="0"/>
+            </w:pPr>
+            <w:r>
+              <w:rPr>
+                <w:sz w:val="7"/>
+              </w:rPr>
+              <w:t>DEV-01-BTN-CANDIDATE-DECIDE</w:t>
+            </w:r>
+          </w:p>
+        </w:tc>
+        <w:tc>
+          <w:tcPr>
+            <w:tcW w:type="dxa" w:w="3206"/>
+          </w:tcPr>
+          <w:p>
+            <w:pPr>
+              <w:spacing w:before="0" w:after="0"/>
+            </w:pPr>
+            <w:r>
+              <w:rPr>
+                <w:sz w:val="7"/>
+              </w:rPr>
+              <w:t>decideCandidate</w:t>
+            </w:r>
+          </w:p>
+        </w:tc>
+        <w:tc>
+          <w:tcPr>
+            <w:tcW w:type="dxa" w:w="3206"/>
+          </w:tcPr>
+          <w:p>
+            <w:pPr>
+              <w:spacing w:before="0" w:after="0"/>
+            </w:pPr>
+            <w:r>
+              <w:rPr>
+                <w:sz w:val="7"/>
+              </w:rPr>
+              <w:t>DecideEnterpriseCandidateRequest</w:t>
+            </w:r>
+          </w:p>
+        </w:tc>
+        <w:tc>
+          <w:tcPr>
+            <w:tcW w:type="dxa" w:w="3206"/>
+          </w:tcPr>
+          <w:p>
+            <w:pPr>
+              <w:spacing w:before="0" w:after="0"/>
+            </w:pPr>
+            <w:r>
+              <w:rPr>
+                <w:sz w:val="7"/>
+              </w:rPr>
+              <w:t>UNCHANGED</w:t>
+            </w:r>
+          </w:p>
+        </w:tc>
+        <w:tc>
+          <w:tcPr>
+            <w:tcW w:type="dxa" w:w="3206"/>
+          </w:tcPr>
+          <w:p>
+            <w:pPr>
+              <w:spacing w:before="0" w:after="0"/>
+            </w:pPr>
+            <w:r>
+              <w:rPr>
+                <w:sz w:val="7"/>
+              </w:rPr>
+              <w:t>Decision must bind exact candidate/version and review evidence. Existing persistence public.context_candidates remains unchanged.</w:t>
+            </w:r>
+          </w:p>
+        </w:tc>
+      </w:tr>
+      <w:tr>
+        <w:tc>
+          <w:tcPr>
+            <w:tcW w:type="dxa" w:w="3206"/>
+          </w:tcPr>
+          <w:p>
+            <w:pPr>
+              <w:spacing w:before="0" w:after="0"/>
+            </w:pPr>
+            <w:r>
+              <w:rPr>
+                <w:sz w:val="7"/>
+              </w:rPr>
+              <w:t>DEV-01-BTN-CR-CREATE</w:t>
+            </w:r>
+          </w:p>
+        </w:tc>
+        <w:tc>
+          <w:tcPr>
+            <w:tcW w:type="dxa" w:w="3206"/>
+          </w:tcPr>
+          <w:p>
+            <w:pPr>
+              <w:spacing w:before="0" w:after="0"/>
+            </w:pPr>
+            <w:r>
+              <w:rPr>
+                <w:sz w:val="7"/>
+              </w:rPr>
+              <w:t>createChangeRequest</w:t>
+            </w:r>
+          </w:p>
+        </w:tc>
+        <w:tc>
+          <w:tcPr>
+            <w:tcW w:type="dxa" w:w="3206"/>
+          </w:tcPr>
+          <w:p>
+            <w:pPr>
+              <w:spacing w:before="0" w:after="0"/>
+            </w:pPr>
+            <w:r>
+              <w:rPr>
+                <w:sz w:val="7"/>
+              </w:rPr>
+              <w:t>CreateEnterpriseChangeRequestRequest</w:t>
+            </w:r>
+          </w:p>
+        </w:tc>
+        <w:tc>
+          <w:tcPr>
+            <w:tcW w:type="dxa" w:w="3206"/>
+          </w:tcPr>
+          <w:p>
+            <w:pPr>
+              <w:spacing w:before="0" w:after="0"/>
+            </w:pPr>
+            <w:r>
+              <w:rPr>
+                <w:sz w:val="7"/>
+              </w:rPr>
+              <w:t>Existing Governed Change Request Owner / ChangeRequest + Audit</w:t>
+            </w:r>
+          </w:p>
+        </w:tc>
+        <w:tc>
+          <w:tcPr>
+            <w:tcW w:type="dxa" w:w="3206"/>
+          </w:tcPr>
+          <w:p>
+            <w:pPr>
+              <w:spacing w:before="0" w:after="0"/>
+            </w:pPr>
+            <w:r>
+              <w:rPr>
+                <w:sz w:val="7"/>
+              </w:rPr>
+              <w:t>Change Request records requested correction/change scope and audit lineage; it does not itself mutate canonical enterprise state.</w:t>
+            </w:r>
+          </w:p>
+        </w:tc>
+      </w:tr>
+      <w:tr>
+        <w:tc>
+          <w:tcPr>
+            <w:tcW w:type="dxa" w:w="3206"/>
+          </w:tcPr>
+          <w:p>
+            <w:pPr>
+              <w:spacing w:before="0" w:after="0"/>
+            </w:pPr>
+            <w:r>
+              <w:rPr>
+                <w:sz w:val="7"/>
+              </w:rPr>
+              <w:t>DEV-01-BTN-DIRECTORY-SEARCH</w:t>
+            </w:r>
+          </w:p>
+        </w:tc>
+        <w:tc>
+          <w:tcPr>
+            <w:tcW w:type="dxa" w:w="3206"/>
+          </w:tcPr>
+          <w:p>
+            <w:pPr>
+              <w:spacing w:before="0" w:after="0"/>
+            </w:pPr>
+            <w:r>
+              <w:rPr>
+                <w:sz w:val="7"/>
+              </w:rPr>
+              <w:t>searchProjection</w:t>
+            </w:r>
+          </w:p>
+        </w:tc>
+        <w:tc>
+          <w:tcPr>
+            <w:tcW w:type="dxa" w:w="3206"/>
+          </w:tcPr>
+          <w:p>
+            <w:pPr>
+              <w:spacing w:before="0" w:after="0"/>
+            </w:pPr>
+            <w:r>
+              <w:rPr>
+                <w:sz w:val="7"/>
+              </w:rPr>
+              <w:t>SearchEnterpriseDirectoryProjectionRequest</w:t>
+            </w:r>
+          </w:p>
+        </w:tc>
+        <w:tc>
+          <w:tcPr>
+            <w:tcW w:type="dxa" w:w="3206"/>
+          </w:tcPr>
+          <w:p>
+            <w:pPr>
+              <w:spacing w:before="0" w:after="0"/>
+            </w:pPr>
+            <w:r>
+              <w:rPr>
+                <w:sz w:val="7"/>
+              </w:rPr>
+              <w:t>Global Brain / SemanticIndexResult + Search Audit</w:t>
+            </w:r>
+          </w:p>
+        </w:tc>
+        <w:tc>
+          <w:tcPr>
+            <w:tcW w:type="dxa" w:w="3206"/>
+          </w:tcPr>
+          <w:p>
+            <w:pPr>
+              <w:spacing w:before="0" w:after="0"/>
+            </w:pPr>
+            <w:r>
+              <w:rPr>
+                <w:sz w:val="7"/>
+              </w:rPr>
+              <w:t>Directory search is a derived projection/search contract and must not create a duplicate CompanyMaster or independent directory truth store.</w:t>
+            </w:r>
+          </w:p>
+        </w:tc>
+      </w:tr>
+      <w:tr>
+        <w:tc>
+          <w:tcPr>
+            <w:tcW w:type="dxa" w:w="3206"/>
+          </w:tcPr>
+          <w:p>
+            <w:pPr>
+              <w:spacing w:before="0" w:after="0"/>
+            </w:pPr>
+            <w:r>
+              <w:rPr>
+                <w:sz w:val="7"/>
+              </w:rPr>
+              <w:t>DEV-01-BTN-DISCOVERY-PAUSE</w:t>
+            </w:r>
+          </w:p>
+        </w:tc>
+        <w:tc>
+          <w:tcPr>
+            <w:tcW w:type="dxa" w:w="3206"/>
+          </w:tcPr>
+          <w:p>
+            <w:pPr>
+              <w:spacing w:before="0" w:after="0"/>
+            </w:pPr>
+            <w:r>
+              <w:rPr>
+                <w:sz w:val="7"/>
+              </w:rPr>
+              <w:t>pauseCompanyDiscovery</w:t>
+            </w:r>
+          </w:p>
+        </w:tc>
+        <w:tc>
+          <w:tcPr>
+            <w:tcW w:type="dxa" w:w="3206"/>
+          </w:tcPr>
+          <w:p>
+            <w:pPr>
+              <w:spacing w:before="0" w:after="0"/>
+            </w:pPr>
+            <w:r>
+              <w:rPr>
+                <w:sz w:val="7"/>
+              </w:rPr>
+              <w:t>PauseCompanyDiscoveryRequest</w:t>
+            </w:r>
+          </w:p>
+        </w:tc>
+        <w:tc>
+          <w:tcPr>
+            <w:tcW w:type="dxa" w:w="3206"/>
+          </w:tcPr>
+          <w:p>
+            <w:pPr>
+              <w:spacing w:before="0" w:after="0"/>
+            </w:pPr>
+            <w:r>
+              <w:rPr>
+                <w:sz w:val="7"/>
+              </w:rPr>
+              <w:t>Shared Acquisition / Knowledge Owner / DiscoveryJob State + Audit</w:t>
+            </w:r>
+          </w:p>
+        </w:tc>
+        <w:tc>
+          <w:tcPr>
+            <w:tcW w:type="dxa" w:w="3206"/>
+          </w:tcPr>
+          <w:p>
+            <w:pPr>
+              <w:spacing w:before="0" w:after="0"/>
+            </w:pPr>
+            <w:r>
+              <w:rPr>
+                <w:sz w:val="7"/>
+              </w:rPr>
+              <w:t>Pause changes only the exact DiscoveryJob state with actor/reason/version audit; it does not replace the shared acquisition engine.</w:t>
+            </w:r>
+          </w:p>
+        </w:tc>
+      </w:tr>
+      <w:tr>
+        <w:tc>
+          <w:tcPr>
+            <w:tcW w:type="dxa" w:w="3206"/>
+          </w:tcPr>
+          <w:p>
+            <w:pPr>
+              <w:spacing w:before="0" w:after="0"/>
+            </w:pPr>
+            <w:r>
+              <w:rPr>
+                <w:sz w:val="7"/>
+              </w:rPr>
+              <w:t>DEV-01-BTN-DISCOVERY-RESUME</w:t>
+            </w:r>
+          </w:p>
+        </w:tc>
+        <w:tc>
+          <w:tcPr>
+            <w:tcW w:type="dxa" w:w="3206"/>
+          </w:tcPr>
+          <w:p>
+            <w:pPr>
+              <w:spacing w:before="0" w:after="0"/>
+            </w:pPr>
+            <w:r>
+              <w:rPr>
+                <w:sz w:val="7"/>
+              </w:rPr>
+              <w:t>resumeCompanyDiscovery</w:t>
+            </w:r>
+          </w:p>
+        </w:tc>
+        <w:tc>
+          <w:tcPr>
+            <w:tcW w:type="dxa" w:w="3206"/>
+          </w:tcPr>
+          <w:p>
+            <w:pPr>
+              <w:spacing w:before="0" w:after="0"/>
+            </w:pPr>
+            <w:r>
+              <w:rPr>
+                <w:sz w:val="7"/>
+              </w:rPr>
+              <w:t>ResumeCompanyDiscoveryRequest</w:t>
+            </w:r>
+          </w:p>
+        </w:tc>
+        <w:tc>
+          <w:tcPr>
+            <w:tcW w:type="dxa" w:w="3206"/>
+          </w:tcPr>
+          <w:p>
+            <w:pPr>
+              <w:spacing w:before="0" w:after="0"/>
+            </w:pPr>
+            <w:r>
+              <w:rPr>
+                <w:sz w:val="7"/>
+              </w:rPr>
+              <w:t>Shared Acquisition / Knowledge Owner / DiscoveryJob State + Audit</w:t>
+            </w:r>
+          </w:p>
+        </w:tc>
+        <w:tc>
+          <w:tcPr>
+            <w:tcW w:type="dxa" w:w="3206"/>
+          </w:tcPr>
+          <w:p>
+            <w:pPr>
+              <w:spacing w:before="0" w:after="0"/>
+            </w:pPr>
+            <w:r>
+              <w:rPr>
+                <w:sz w:val="7"/>
+              </w:rPr>
+              <w:t>Resume requires exact paused job/version and preserves prior attempts/evidence.</w:t>
+            </w:r>
+          </w:p>
+        </w:tc>
+      </w:tr>
+      <w:tr>
+        <w:tc>
+          <w:tcPr>
+            <w:tcW w:type="dxa" w:w="3206"/>
+          </w:tcPr>
+          <w:p>
+            <w:pPr>
+              <w:spacing w:before="0" w:after="0"/>
+            </w:pPr>
+            <w:r>
+              <w:rPr>
+                <w:sz w:val="7"/>
+              </w:rPr>
+              <w:t>DEV-01-BTN-DISCOVERY-START</w:t>
+            </w:r>
+          </w:p>
+        </w:tc>
+        <w:tc>
+          <w:tcPr>
+            <w:tcW w:type="dxa" w:w="3206"/>
+          </w:tcPr>
+          <w:p>
+            <w:pPr>
+              <w:spacing w:before="0" w:after="0"/>
+            </w:pPr>
+            <w:r>
+              <w:rPr>
+                <w:sz w:val="7"/>
+              </w:rPr>
+              <w:t>startCompanyDiscovery</w:t>
+            </w:r>
+          </w:p>
+        </w:tc>
+        <w:tc>
+          <w:tcPr>
+            <w:tcW w:type="dxa" w:w="3206"/>
+          </w:tcPr>
+          <w:p>
+            <w:pPr>
+              <w:spacing w:before="0" w:after="0"/>
+            </w:pPr>
+            <w:r>
+              <w:rPr>
+                <w:sz w:val="7"/>
+              </w:rPr>
+              <w:t>StartCompanyDiscoveryRequest</w:t>
+            </w:r>
+          </w:p>
+        </w:tc>
+        <w:tc>
+          <w:tcPr>
+            <w:tcW w:type="dxa" w:w="3206"/>
+          </w:tcPr>
+          <w:p>
+            <w:pPr>
+              <w:spacing w:before="0" w:after="0"/>
+            </w:pPr>
+            <w:r>
+              <w:rPr>
+                <w:sz w:val="7"/>
+              </w:rPr>
+              <w:t>Shared Acquisition / Knowledge Owner / DiscoveryJob + Audit</w:t>
+            </w:r>
+          </w:p>
+        </w:tc>
+        <w:tc>
+          <w:tcPr>
+            <w:tcW w:type="dxa" w:w="3206"/>
+          </w:tcPr>
+          <w:p>
+            <w:pPr>
+              <w:spacing w:before="0" w:after="0"/>
+            </w:pPr>
+            <w:r>
+              <w:rPr>
+                <w:sz w:val="7"/>
+              </w:rPr>
+              <w:t>Start creates/binds a DiscoveryJob from an authorized active profile and allowed source scope; connector absence remains BLOCK/RETRY, not simulated success.</w:t>
+            </w:r>
+          </w:p>
+        </w:tc>
+      </w:tr>
+      <w:tr>
+        <w:tc>
+          <w:tcPr>
+            <w:tcW w:type="dxa" w:w="3206"/>
+          </w:tcPr>
+          <w:p>
+            <w:pPr>
+              <w:spacing w:before="0" w:after="0"/>
+            </w:pPr>
+            <w:r>
+              <w:rPr>
+                <w:sz w:val="7"/>
+              </w:rPr>
+              <w:t>DEV-01-BTN-DISCOVERY-STOP</w:t>
+            </w:r>
+          </w:p>
+        </w:tc>
+        <w:tc>
+          <w:tcPr>
+            <w:tcW w:type="dxa" w:w="3206"/>
+          </w:tcPr>
+          <w:p>
+            <w:pPr>
+              <w:spacing w:before="0" w:after="0"/>
+            </w:pPr>
+            <w:r>
+              <w:rPr>
+                <w:sz w:val="7"/>
+              </w:rPr>
+              <w:t>stopCompanyDiscovery</w:t>
+            </w:r>
+          </w:p>
+        </w:tc>
+        <w:tc>
+          <w:tcPr>
+            <w:tcW w:type="dxa" w:w="3206"/>
+          </w:tcPr>
+          <w:p>
+            <w:pPr>
+              <w:spacing w:before="0" w:after="0"/>
+            </w:pPr>
+            <w:r>
+              <w:rPr>
+                <w:sz w:val="7"/>
+              </w:rPr>
+              <w:t>StopCompanyDiscoveryRequest</w:t>
+            </w:r>
+          </w:p>
+        </w:tc>
+        <w:tc>
+          <w:tcPr>
+            <w:tcW w:type="dxa" w:w="3206"/>
+          </w:tcPr>
+          <w:p>
+            <w:pPr>
+              <w:spacing w:before="0" w:after="0"/>
+            </w:pPr>
+            <w:r>
+              <w:rPr>
+                <w:sz w:val="7"/>
+              </w:rPr>
+              <w:t>Shared Acquisition / Knowledge Owner / DiscoveryJob State + Audit</w:t>
+            </w:r>
+          </w:p>
+        </w:tc>
+        <w:tc>
+          <w:tcPr>
+            <w:tcW w:type="dxa" w:w="3206"/>
+          </w:tcPr>
+          <w:p>
+            <w:pPr>
+              <w:spacing w:before="0" w:after="0"/>
+            </w:pPr>
+            <w:r>
+              <w:rPr>
+                <w:sz w:val="7"/>
+              </w:rPr>
+              <w:t>Stop closes the legal target job scope while preserving historical evidence and replay/idempotency lineage.</w:t>
+            </w:r>
+          </w:p>
+        </w:tc>
+      </w:tr>
+      <w:tr>
+        <w:tc>
+          <w:tcPr>
+            <w:tcW w:type="dxa" w:w="3206"/>
+          </w:tcPr>
+          <w:p>
+            <w:pPr>
+              <w:spacing w:before="0" w:after="0"/>
+            </w:pPr>
+            <w:r>
+              <w:rPr>
+                <w:sz w:val="7"/>
+              </w:rPr>
+              <w:t>DEV-01-BTN-EMAIL-DISPATCH</w:t>
+            </w:r>
+          </w:p>
+        </w:tc>
+        <w:tc>
+          <w:tcPr>
+            <w:tcW w:type="dxa" w:w="3206"/>
+          </w:tcPr>
+          <w:p>
+            <w:pPr>
+              <w:spacing w:before="0" w:after="0"/>
+            </w:pPr>
+            <w:r>
+              <w:rPr>
+                <w:sz w:val="7"/>
+              </w:rPr>
+              <w:t>dispatchOutreachCampaign</w:t>
+            </w:r>
+          </w:p>
+        </w:tc>
+        <w:tc>
+          <w:tcPr>
+            <w:tcW w:type="dxa" w:w="3206"/>
+          </w:tcPr>
+          <w:p>
+            <w:pPr>
+              <w:spacing w:before="0" w:after="0"/>
+            </w:pPr>
+            <w:r>
+              <w:rPr>
+                <w:sz w:val="7"/>
+              </w:rPr>
+              <w:t>DispatchOutreachCampaignRequest</w:t>
+            </w:r>
+          </w:p>
+        </w:tc>
+        <w:tc>
+          <w:tcPr>
+            <w:tcW w:type="dxa" w:w="3206"/>
+          </w:tcPr>
+          <w:p>
+            <w:pPr>
+              <w:spacing w:before="0" w:after="0"/>
+            </w:pPr>
+            <w:r>
+              <w:rPr>
+                <w:sz w:val="7"/>
+              </w:rPr>
+              <w:t>Existing Outreach Owner / Campaign Dispatch + IndividualDelivery + Audit</w:t>
+            </w:r>
+          </w:p>
+        </w:tc>
+        <w:tc>
+          <w:tcPr>
+            <w:tcW w:type="dxa" w:w="3206"/>
+          </w:tcPr>
+          <w:p>
+            <w:pPr>
+              <w:spacing w:before="0" w:after="0"/>
+            </w:pPr>
+            <w:r>
+              <w:rPr>
+                <w:sz w:val="7"/>
+              </w:rPr>
+              <w:t>Dispatch fans out approved Campaign recipients into exactly-one-To IndividualDelivery units. Provider acceptance and Production connector E2E remain separate runtime evidence.</w:t>
+            </w:r>
+          </w:p>
+        </w:tc>
+      </w:tr>
+      <w:tr>
+        <w:tc>
+          <w:tcPr>
+            <w:tcW w:type="dxa" w:w="3206"/>
+          </w:tcPr>
+          <w:p>
+            <w:pPr>
+              <w:spacing w:before="0" w:after="0"/>
+            </w:pPr>
+            <w:r>
+              <w:rPr>
+                <w:sz w:val="7"/>
+              </w:rPr>
+              <w:t>DEV-01-BTN-EXPORT</w:t>
+            </w:r>
+          </w:p>
+        </w:tc>
+        <w:tc>
+          <w:tcPr>
+            <w:tcW w:type="dxa" w:w="3206"/>
+          </w:tcPr>
+          <w:p>
+            <w:pPr>
+              <w:spacing w:before="0" w:after="0"/>
+            </w:pPr>
+            <w:r>
+              <w:rPr>
+                <w:sz w:val="7"/>
+              </w:rPr>
+              <w:t>exportProjection</w:t>
+            </w:r>
+          </w:p>
+        </w:tc>
+        <w:tc>
+          <w:tcPr>
+            <w:tcW w:type="dxa" w:w="3206"/>
+          </w:tcPr>
+          <w:p>
+            <w:pPr>
+              <w:spacing w:before="0" w:after="0"/>
+            </w:pPr>
+            <w:r>
+              <w:rPr>
+                <w:sz w:val="7"/>
+              </w:rPr>
+              <w:t>ExportEnterpriseProjectionRequest</w:t>
+            </w:r>
+          </w:p>
+        </w:tc>
+        <w:tc>
+          <w:tcPr>
+            <w:tcW w:type="dxa" w:w="3206"/>
+          </w:tcPr>
+          <w:p>
+            <w:pPr>
+              <w:spacing w:before="0" w:after="0"/>
+            </w:pPr>
+            <w:r>
+              <w:rPr>
+                <w:sz w:val="7"/>
+              </w:rPr>
+              <w:t>Existing Projection/Export Owner / Enterprise Export Artifact + Export Audit</w:t>
+            </w:r>
+          </w:p>
+        </w:tc>
+        <w:tc>
+          <w:tcPr>
+            <w:tcW w:type="dxa" w:w="3206"/>
+          </w:tcPr>
+          <w:p>
+            <w:pPr>
+              <w:spacing w:before="0" w:after="0"/>
+            </w:pPr>
+            <w:r>
+              <w:rPr>
+                <w:sz w:val="7"/>
+              </w:rPr>
+              <w:t>Export persists an authorized derived artifact and audit lineage only; permission/classification/privacy/suppression gates remain mandatory.</w:t>
+            </w:r>
+          </w:p>
+        </w:tc>
+      </w:tr>
+      <w:tr>
+        <w:tc>
+          <w:tcPr>
+            <w:tcW w:type="dxa" w:w="3206"/>
+          </w:tcPr>
+          <w:p>
+            <w:pPr>
+              <w:spacing w:before="0" w:after="0"/>
+            </w:pPr>
+            <w:r>
+              <w:rPr>
+                <w:sz w:val="7"/>
+              </w:rPr>
+              <w:t>DEV-01-BTN-KILL-SWITCH</w:t>
+            </w:r>
+          </w:p>
+        </w:tc>
+        <w:tc>
+          <w:tcPr>
+            <w:tcW w:type="dxa" w:w="3206"/>
+          </w:tcPr>
+          <w:p>
+            <w:pPr>
+              <w:spacing w:before="0" w:after="0"/>
+            </w:pPr>
+            <w:r>
+              <w:rPr>
+                <w:sz w:val="7"/>
+              </w:rPr>
+              <w:t>setKillSwitch</w:t>
+            </w:r>
+          </w:p>
+        </w:tc>
+        <w:tc>
+          <w:tcPr>
+            <w:tcW w:type="dxa" w:w="3206"/>
+          </w:tcPr>
+          <w:p>
+            <w:pPr>
+              <w:spacing w:before="0" w:after="0"/>
+            </w:pPr>
+            <w:r>
+              <w:rPr>
+                <w:sz w:val="7"/>
+              </w:rPr>
+              <w:t>SetEnterpriseOutreachKillSwitchRequest</w:t>
+            </w:r>
+          </w:p>
+        </w:tc>
+        <w:tc>
+          <w:tcPr>
+            <w:tcW w:type="dxa" w:w="3206"/>
+          </w:tcPr>
+          <w:p>
+            <w:pPr>
+              <w:spacing w:before="0" w:after="0"/>
+            </w:pPr>
+            <w:r>
+              <w:rPr>
+                <w:sz w:val="7"/>
+              </w:rPr>
+              <w:t>Existing Operations Governance / Kill Switch State + Audit</w:t>
+            </w:r>
+          </w:p>
+        </w:tc>
+        <w:tc>
+          <w:tcPr>
+            <w:tcW w:type="dxa" w:w="3206"/>
+          </w:tcPr>
+          <w:p>
+            <w:pPr>
+              <w:spacing w:before="0" w:after="0"/>
+            </w:pPr>
+            <w:r>
+              <w:rPr>
+                <w:sz w:val="7"/>
+              </w:rPr>
+              <w:t>Kill switch stops eligible pending/in-flight legal scope and records actor/reason/time. Already-completed sends remain immutable historical facts.</w:t>
+            </w:r>
+          </w:p>
+        </w:tc>
+      </w:tr>
+      <w:tr>
+        <w:tc>
+          <w:tcPr>
+            <w:tcW w:type="dxa" w:w="3206"/>
+          </w:tcPr>
+          <w:p>
+            <w:pPr>
+              <w:spacing w:before="0" w:after="0"/>
+            </w:pPr>
+            <w:r>
+              <w:rPr>
+                <w:sz w:val="7"/>
+              </w:rPr>
+              <w:t>DEV-01-BTN-MERGE</w:t>
+            </w:r>
+          </w:p>
+        </w:tc>
+        <w:tc>
+          <w:tcPr>
+            <w:tcW w:type="dxa" w:w="3206"/>
+          </w:tcPr>
+          <w:p>
+            <w:pPr>
+              <w:spacing w:before="0" w:after="0"/>
+            </w:pPr>
+            <w:r>
+              <w:rPr>
+                <w:sz w:val="7"/>
+              </w:rPr>
+              <w:t>mergeCompanyCandidate</w:t>
+            </w:r>
+          </w:p>
+        </w:tc>
+        <w:tc>
+          <w:tcPr>
+            <w:tcW w:type="dxa" w:w="3206"/>
+          </w:tcPr>
+          <w:p>
+            <w:pPr>
+              <w:spacing w:before="0" w:after="0"/>
+            </w:pPr>
+            <w:r>
+              <w:rPr>
+                <w:sz w:val="7"/>
+              </w:rPr>
+              <w:t>MergeCompanyCandidateRequest</w:t>
+            </w:r>
+          </w:p>
+        </w:tc>
+        <w:tc>
+          <w:tcPr>
+            <w:tcW w:type="dxa" w:w="3206"/>
+          </w:tcPr>
+          <w:p>
+            <w:pPr>
+              <w:spacing w:before="0" w:after="0"/>
+            </w:pPr>
+            <w:r>
+              <w:rPr>
+                <w:sz w:val="7"/>
+              </w:rPr>
+              <w:t>Existing Enterprise Development Owner / CompanyMaster + CompanyMergeDecision + Lineage Audit</w:t>
+            </w:r>
+          </w:p>
+        </w:tc>
+        <w:tc>
+          <w:tcPr>
+            <w:tcW w:type="dxa" w:w="3206"/>
+          </w:tcPr>
+          <w:p>
+            <w:pPr>
+              <w:spacing w:before="0" w:after="0"/>
+            </w:pPr>
+            <w:r>
+              <w:rPr>
+                <w:sz w:val="7"/>
+              </w:rPr>
+              <w:t>Effectful merge requires prior preview, exact survivor/merged refs and no blocking conflict; aliases/evidence/contacts/history/suppression lineage must be preserved.</w:t>
+            </w:r>
+          </w:p>
+        </w:tc>
+      </w:tr>
+      <w:tr>
+        <w:tc>
+          <w:tcPr>
+            <w:tcW w:type="dxa" w:w="3206"/>
+          </w:tcPr>
+          <w:p>
+            <w:pPr>
+              <w:spacing w:before="0" w:after="0"/>
+            </w:pPr>
+            <w:r>
+              <w:rPr>
+                <w:sz w:val="7"/>
+              </w:rPr>
+              <w:t>DEV-01-BTN-MERGE-PREVIEW</w:t>
+            </w:r>
+          </w:p>
+        </w:tc>
+        <w:tc>
+          <w:tcPr>
+            <w:tcW w:type="dxa" w:w="3206"/>
+          </w:tcPr>
+          <w:p>
+            <w:pPr>
+              <w:spacing w:before="0" w:after="0"/>
+            </w:pPr>
+            <w:r>
+              <w:rPr>
+                <w:sz w:val="7"/>
+              </w:rPr>
+              <w:t>previewCompanyMerge</w:t>
+            </w:r>
+          </w:p>
+        </w:tc>
+        <w:tc>
+          <w:tcPr>
+            <w:tcW w:type="dxa" w:w="3206"/>
+          </w:tcPr>
+          <w:p>
+            <w:pPr>
+              <w:spacing w:before="0" w:after="0"/>
+            </w:pPr>
+            <w:r>
+              <w:rPr>
+                <w:sz w:val="7"/>
+              </w:rPr>
+              <w:t>PreviewCompanyMergeRequest</w:t>
+            </w:r>
+          </w:p>
+        </w:tc>
+        <w:tc>
+          <w:tcPr>
+            <w:tcW w:type="dxa" w:w="3206"/>
+          </w:tcPr>
+          <w:p>
+            <w:pPr>
+              <w:spacing w:before="0" w:after="0"/>
+            </w:pPr>
+            <w:r>
+              <w:rPr>
+                <w:sz w:val="7"/>
+              </w:rPr>
+              <w:t>Existing Enterprise Development Owner / CompanyMergeCandidate + Merge Preview Evidence</w:t>
+            </w:r>
+          </w:p>
+        </w:tc>
+        <w:tc>
+          <w:tcPr>
+            <w:tcW w:type="dxa" w:w="3206"/>
+          </w:tcPr>
+          <w:p>
+            <w:pPr>
+              <w:spacing w:before="0" w:after="0"/>
+            </w:pPr>
+            <w:r>
+              <w:rPr>
+                <w:sz w:val="7"/>
+              </w:rPr>
+              <w:t>Preview records candidate identity conflicts/survivor/lineage evidence only and cannot itself merge or delete CompanyMaster history.</w:t>
+            </w:r>
+          </w:p>
+        </w:tc>
+      </w:tr>
+      <w:tr>
+        <w:tc>
+          <w:tcPr>
+            <w:tcW w:type="dxa" w:w="3206"/>
+          </w:tcPr>
+          <w:p>
+            <w:pPr>
+              <w:spacing w:before="0" w:after="0"/>
+            </w:pPr>
+            <w:r>
+              <w:rPr>
+                <w:sz w:val="7"/>
+              </w:rPr>
+              <w:t>DEV-01-BTN-REFRESH</w:t>
+            </w:r>
+          </w:p>
+        </w:tc>
+        <w:tc>
+          <w:tcPr>
+            <w:tcW w:type="dxa" w:w="3206"/>
+          </w:tcPr>
+          <w:p>
+            <w:pPr>
+              <w:spacing w:before="0" w:after="0"/>
+            </w:pPr>
+            <w:r>
+              <w:rPr>
+                <w:sz w:val="7"/>
+              </w:rPr>
+              <w:t>refreshProjection</w:t>
+            </w:r>
+          </w:p>
+        </w:tc>
+        <w:tc>
+          <w:tcPr>
+            <w:tcW w:type="dxa" w:w="3206"/>
+          </w:tcPr>
+          <w:p>
+            <w:pPr>
+              <w:spacing w:before="0" w:after="0"/>
+            </w:pPr>
+            <w:r>
+              <w:rPr>
+                <w:sz w:val="7"/>
+              </w:rPr>
+              <w:t>RefreshEnterpriseProjectionRequest</w:t>
+            </w:r>
+          </w:p>
+        </w:tc>
+        <w:tc>
+          <w:tcPr>
+            <w:tcW w:type="dxa" w:w="3206"/>
+          </w:tcPr>
+          <w:p>
+            <w:pPr>
+              <w:spacing w:before="0" w:after="0"/>
+            </w:pPr>
+            <w:r>
+              <w:rPr>
+                <w:sz w:val="7"/>
+              </w:rPr>
+              <w:t>Global Brain / Enterprise Projection + Projection Audit</w:t>
+            </w:r>
+          </w:p>
+        </w:tc>
+        <w:tc>
+          <w:tcPr>
+            <w:tcW w:type="dxa" w:w="3206"/>
+          </w:tcPr>
+          <w:p>
+            <w:pPr>
+              <w:spacing w:before="0" w:after="0"/>
+            </w:pPr>
+            <w:r>
+              <w:rPr>
+                <w:sz w:val="7"/>
+              </w:rPr>
+              <w:t>Refresh rematerializes derived enterprise projection state from canonical owners; projection cannot become a second Company/Campaign/Delivery truth.</w:t>
+            </w:r>
+          </w:p>
+        </w:tc>
+      </w:tr>
+    </w:tbl>
     <w:sectPr>
-      <w:pgSz w:w="11906" w:h="16838" w:orient="landscape"/>
+      <w:pgSz w:w="16838" w:h="11906" w:orient="landscape"/>
       <w:pgMar w:top="475" w:right="403" w:bottom="475" w:left="403" w:header="283" w:footer="283" w:gutter="0"/>
       <w:cols w:space="720"/>
       <w:docGrid w:linePitch="360"/>

</xml_diff>

<commit_message>
fix(acpos): resolve compound business entity source rows
</commit_message>
<xml_diff>
--- a/ACPOS_DEV-01_企業自動開發系統_Mother_Basic_Design_OPTIMIZED.docx
+++ b/ACPOS_DEV-01_企業自動開發系統_Mother_Basic_Design_OPTIMIZED.docx
@@ -1616,7 +1616,7 @@
                 <w:color w:val="18203A"/>
                 <w:sz w:val="13"/>
               </w:rPr>
-              <w:t>Discovery Profile / Topic</w:t>
+              <w:t>Discovery Profile</w:t>
             </w:r>
           </w:p>
         </w:tc>
@@ -1651,7 +1651,7 @@
                 <w:color w:val="18203A"/>
                 <w:sz w:val="13"/>
               </w:rPr>
-              <w:t>描述要找的商機條件與來源範圍</w:t>
+              <w:t>描述要找的商機條件與來源範圍；Topic 為 Profile 的條件／篩選值，不是獨立 Business Entity。</w:t>
             </w:r>
           </w:p>
         </w:tc>
@@ -2631,7 +2631,7 @@
                 <w:color w:val="18203A"/>
                 <w:sz w:val="13"/>
               </w:rPr>
-              <w:t>Campaign / Audience</w:t>
+              <w:t>Campaign</w:t>
             </w:r>
           </w:p>
         </w:tc>
@@ -2666,7 +2666,7 @@
                 <w:color w:val="18203A"/>
                 <w:sz w:val="13"/>
               </w:rPr>
-              <w:t>受眾批次、審查、統計</w:t>
+              <w:t>受眾批次、審查、統計；Audience Search/Filter 為 projection，不建立第二 Business Entity。</w:t>
             </w:r>
           </w:p>
         </w:tc>
@@ -2701,7 +2701,7 @@
                 <w:color w:val="18203A"/>
                 <w:sz w:val="13"/>
               </w:rPr>
-              <w:t>Search Audience / Create / Preview / Approve</w:t>
+              <w:t>Create / Preview / Approve</w:t>
             </w:r>
           </w:p>
         </w:tc>

</xml_diff>